<commit_message>
Fold in user's edited answers to the Q&A table, polish formatting
Picked up the corrected answers the user wrote directly into the Word
doc (staff creation flow, "will be fixed", "taking into
implementation/development") and cleaned up wording/typos. Added a
numbered column, a repeating colored header, and zebra striping for
readability.
</commit_message>
<xml_diff>
--- a/docs/platform/voprosy-otvety-tablica.docx
+++ b/docs/platform/voprosy-otvety-tablica.docx
@@ -45,83 +45,351 @@
         </w:tblBorders>
       </w:tblPr>
       <w:tblGrid>
-        <w:gridCol w:w="4300"/>
-        <w:gridCol w:w="5000"/>
+        <w:gridCol w:w="460"/>
+        <w:gridCol w:w="4200"/>
+        <w:gridCol w:w="4640"/>
       </w:tblGrid>
       <w:tr>
-        <w:tc>
-          <w:tcPr>
-            <w:tcW w:type="dxa" w:w="4300"/>
-            <w:tcBorders>
-              <w:top w:val="single" w:color="999999" w:sz="4"/>
-              <w:left w:val="single" w:color="999999" w:sz="4"/>
-              <w:bottom w:val="single" w:color="999999" w:sz="4"/>
-              <w:right w:val="single" w:color="999999" w:sz="4"/>
-            </w:tcBorders>
-            <w:shd w:fill="EEF1F6" w:val="clear"/>
-            <w:tcMar>
-              <w:top w:type="dxa" w:w="90"/>
-              <w:left w:type="dxa" w:w="120"/>
-              <w:bottom w:type="dxa" w:w="90"/>
-              <w:right w:type="dxa" w:w="120"/>
-            </w:tcMar>
-          </w:tcPr>
-          <w:p>
+        <w:trPr>
+          <w:tblHeader/>
+        </w:trPr>
+        <w:tc>
+          <w:tcPr>
+            <w:tcW w:type="dxa" w:w="460"/>
+            <w:tcBorders>
+              <w:top w:val="single" w:color="999999" w:sz="4"/>
+              <w:left w:val="single" w:color="999999" w:sz="4"/>
+              <w:bottom w:val="single" w:color="999999" w:sz="4"/>
+              <w:right w:val="single" w:color="999999" w:sz="4"/>
+            </w:tcBorders>
+            <w:shd w:fill="3B5BDB" w:val="clear"/>
+            <w:tcMar>
+              <w:top w:type="dxa" w:w="90"/>
+              <w:left w:type="dxa" w:w="120"/>
+              <w:bottom w:type="dxa" w:w="90"/>
+              <w:right w:type="dxa" w:w="120"/>
+            </w:tcMar>
+          </w:tcPr>
+          <w:p>
+            <w:r>
+              <w:rPr>
+                <w:rFonts w:ascii="Calibri" w:cs="Calibri" w:eastAsia="Calibri" w:hAnsi="Calibri"/>
+                <w:b/>
+                <w:bCs/>
+                <w:color w:val="FFFFFF"/>
+                <w:sz w:val="21"/>
+                <w:szCs w:val="21"/>
+              </w:rPr>
+              <w:t xml:space="preserve">№</w:t>
+            </w:r>
+          </w:p>
+        </w:tc>
+        <w:tc>
+          <w:tcPr>
+            <w:tcW w:type="dxa" w:w="4200"/>
+            <w:tcBorders>
+              <w:top w:val="single" w:color="999999" w:sz="4"/>
+              <w:left w:val="single" w:color="999999" w:sz="4"/>
+              <w:bottom w:val="single" w:color="999999" w:sz="4"/>
+              <w:right w:val="single" w:color="999999" w:sz="4"/>
+            </w:tcBorders>
+            <w:shd w:fill="3B5BDB" w:val="clear"/>
+            <w:tcMar>
+              <w:top w:type="dxa" w:w="90"/>
+              <w:left w:type="dxa" w:w="120"/>
+              <w:bottom w:type="dxa" w:w="90"/>
+              <w:right w:type="dxa" w:w="120"/>
+            </w:tcMar>
+          </w:tcPr>
+          <w:p>
+            <w:r>
+              <w:rPr>
+                <w:rFonts w:ascii="Calibri" w:cs="Calibri" w:eastAsia="Calibri" w:hAnsi="Calibri"/>
+                <w:b/>
+                <w:bCs/>
+                <w:color w:val="FFFFFF"/>
+                <w:sz w:val="21"/>
+                <w:szCs w:val="21"/>
+              </w:rPr>
+              <w:t xml:space="preserve">Вопрос</w:t>
+            </w:r>
+          </w:p>
+        </w:tc>
+        <w:tc>
+          <w:tcPr>
+            <w:tcW w:type="dxa" w:w="4640"/>
+            <w:tcBorders>
+              <w:top w:val="single" w:color="999999" w:sz="4"/>
+              <w:left w:val="single" w:color="999999" w:sz="4"/>
+              <w:bottom w:val="single" w:color="999999" w:sz="4"/>
+              <w:right w:val="single" w:color="999999" w:sz="4"/>
+            </w:tcBorders>
+            <w:shd w:fill="3B5BDB" w:val="clear"/>
+            <w:tcMar>
+              <w:top w:type="dxa" w:w="90"/>
+              <w:left w:type="dxa" w:w="120"/>
+              <w:bottom w:type="dxa" w:w="90"/>
+              <w:right w:type="dxa" w:w="120"/>
+            </w:tcMar>
+          </w:tcPr>
+          <w:p>
+            <w:r>
+              <w:rPr>
+                <w:rFonts w:ascii="Calibri" w:cs="Calibri" w:eastAsia="Calibri" w:hAnsi="Calibri"/>
+                <w:b/>
+                <w:bCs/>
+                <w:color w:val="FFFFFF"/>
+                <w:sz w:val="21"/>
+                <w:szCs w:val="21"/>
+              </w:rPr>
+              <w:t xml:space="preserve">Ответ</w:t>
+            </w:r>
+          </w:p>
+        </w:tc>
+      </w:tr>
+      <w:tr>
+        <w:trPr>
+          <w:cantSplit/>
+        </w:trPr>
+        <w:tc>
+          <w:tcPr>
+            <w:tcW w:type="dxa" w:w="460"/>
+            <w:tcBorders>
+              <w:top w:val="single" w:color="999999" w:sz="4"/>
+              <w:left w:val="single" w:color="999999" w:sz="4"/>
+              <w:bottom w:val="single" w:color="999999" w:sz="4"/>
+              <w:right w:val="single" w:color="999999" w:sz="4"/>
+            </w:tcBorders>
+            <w:shd w:fill="FFFFFF" w:val="clear"/>
+            <w:tcMar>
+              <w:top w:type="dxa" w:w="90"/>
+              <w:left w:type="dxa" w:w="120"/>
+              <w:bottom w:type="dxa" w:w="90"/>
+              <w:right w:type="dxa" w:w="120"/>
+            </w:tcMar>
+          </w:tcPr>
+          <w:p>
+            <w:r>
+              <w:rPr>
+                <w:rFonts w:ascii="Calibri" w:cs="Calibri" w:eastAsia="Calibri" w:hAnsi="Calibri"/>
+                <w:color w:val="555555"/>
+                <w:sz w:val="20"/>
+                <w:szCs w:val="20"/>
+              </w:rPr>
+              <w:t xml:space="preserve">1</w:t>
+            </w:r>
+          </w:p>
+        </w:tc>
+        <w:tc>
+          <w:tcPr>
+            <w:tcW w:type="dxa" w:w="4200"/>
+            <w:tcBorders>
+              <w:top w:val="single" w:color="999999" w:sz="4"/>
+              <w:left w:val="single" w:color="999999" w:sz="4"/>
+              <w:bottom w:val="single" w:color="999999" w:sz="4"/>
+              <w:right w:val="single" w:color="999999" w:sz="4"/>
+            </w:tcBorders>
+            <w:shd w:fill="FFFFFF" w:val="clear"/>
+            <w:tcMar>
+              <w:top w:type="dxa" w:w="90"/>
+              <w:left w:type="dxa" w:w="120"/>
+              <w:bottom w:type="dxa" w:w="90"/>
+              <w:right w:type="dxa" w:w="120"/>
+            </w:tcMar>
+          </w:tcPr>
+          <w:p>
+            <w:pPr>
+              <w:spacing w:line="276"/>
+            </w:pPr>
             <w:r>
               <w:rPr>
                 <w:rFonts w:ascii="Calibri" w:cs="Calibri" w:eastAsia="Calibri" w:hAnsi="Calibri"/>
                 <w:b/>
                 <w:bCs/>
                 <w:color w:val="14181F"/>
-                <w:sz w:val="21"/>
-                <w:szCs w:val="21"/>
-              </w:rPr>
-              <w:t xml:space="preserve">Вопрос</w:t>
-            </w:r>
-          </w:p>
-        </w:tc>
-        <w:tc>
-          <w:tcPr>
-            <w:tcW w:type="dxa" w:w="5000"/>
-            <w:tcBorders>
-              <w:top w:val="single" w:color="999999" w:sz="4"/>
-              <w:left w:val="single" w:color="999999" w:sz="4"/>
-              <w:bottom w:val="single" w:color="999999" w:sz="4"/>
-              <w:right w:val="single" w:color="999999" w:sz="4"/>
-            </w:tcBorders>
-            <w:shd w:fill="EEF1F6" w:val="clear"/>
-            <w:tcMar>
-              <w:top w:type="dxa" w:w="90"/>
-              <w:left w:type="dxa" w:w="120"/>
-              <w:bottom w:type="dxa" w:w="90"/>
-              <w:right w:type="dxa" w:w="120"/>
-            </w:tcMar>
-          </w:tcPr>
-          <w:p>
+                <w:sz w:val="20"/>
+                <w:szCs w:val="20"/>
+              </w:rPr>
+              <w:t xml:space="preserve">Как сделать доступ для ИБ-шников с возможностью работать с настройками анонимизатора без возможности работать с прочими настройками, типа источников данных, лимитов и т.п.?</w:t>
+            </w:r>
+          </w:p>
+        </w:tc>
+        <w:tc>
+          <w:tcPr>
+            <w:tcW w:type="dxa" w:w="4640"/>
+            <w:tcBorders>
+              <w:top w:val="single" w:color="999999" w:sz="4"/>
+              <w:left w:val="single" w:color="999999" w:sz="4"/>
+              <w:bottom w:val="single" w:color="999999" w:sz="4"/>
+              <w:right w:val="single" w:color="999999" w:sz="4"/>
+            </w:tcBorders>
+            <w:shd w:fill="FFFFFF" w:val="clear"/>
+            <w:tcMar>
+              <w:top w:type="dxa" w:w="90"/>
+              <w:left w:type="dxa" w:w="120"/>
+              <w:bottom w:type="dxa" w:w="90"/>
+              <w:right w:type="dxa" w:w="120"/>
+            </w:tcMar>
+          </w:tcPr>
+          <w:p>
+            <w:pPr>
+              <w:spacing w:line="276"/>
+            </w:pPr>
+            <w:r>
+              <w:rPr>
+                <w:rFonts w:ascii="Calibri" w:cs="Calibri" w:eastAsia="Calibri" w:hAnsi="Calibri"/>
+                <w:color w:val="1A1A1A"/>
+                <w:sz w:val="20"/>
+                <w:szCs w:val="20"/>
+              </w:rPr>
+              <w:t xml:space="preserve">В Каталоге заводим как обычного пользователя (не администратора), а доступ в «Рабочее место ИБ» даём отдельно — через «Сотрудники ИБ» с ролью «Оператор ИБ» (для ограниченного доступа) или «Администратор ИБ» (для полного).</w:t>
+            </w:r>
+          </w:p>
+        </w:tc>
+      </w:tr>
+      <w:tr>
+        <w:trPr>
+          <w:cantSplit/>
+        </w:trPr>
+        <w:tc>
+          <w:tcPr>
+            <w:tcW w:type="dxa" w:w="460"/>
+            <w:tcBorders>
+              <w:top w:val="single" w:color="999999" w:sz="4"/>
+              <w:left w:val="single" w:color="999999" w:sz="4"/>
+              <w:bottom w:val="single" w:color="999999" w:sz="4"/>
+              <w:right w:val="single" w:color="999999" w:sz="4"/>
+            </w:tcBorders>
+            <w:shd w:fill="F4F6FB" w:val="clear"/>
+            <w:tcMar>
+              <w:top w:type="dxa" w:w="90"/>
+              <w:left w:type="dxa" w:w="120"/>
+              <w:bottom w:type="dxa" w:w="90"/>
+              <w:right w:type="dxa" w:w="120"/>
+            </w:tcMar>
+          </w:tcPr>
+          <w:p>
+            <w:r>
+              <w:rPr>
+                <w:rFonts w:ascii="Calibri" w:cs="Calibri" w:eastAsia="Calibri" w:hAnsi="Calibri"/>
+                <w:color w:val="555555"/>
+                <w:sz w:val="20"/>
+                <w:szCs w:val="20"/>
+              </w:rPr>
+              <w:t xml:space="preserve">2</w:t>
+            </w:r>
+          </w:p>
+        </w:tc>
+        <w:tc>
+          <w:tcPr>
+            <w:tcW w:type="dxa" w:w="4200"/>
+            <w:tcBorders>
+              <w:top w:val="single" w:color="999999" w:sz="4"/>
+              <w:left w:val="single" w:color="999999" w:sz="4"/>
+              <w:bottom w:val="single" w:color="999999" w:sz="4"/>
+              <w:right w:val="single" w:color="999999" w:sz="4"/>
+            </w:tcBorders>
+            <w:shd w:fill="F4F6FB" w:val="clear"/>
+            <w:tcMar>
+              <w:top w:type="dxa" w:w="90"/>
+              <w:left w:type="dxa" w:w="120"/>
+              <w:bottom w:type="dxa" w:w="90"/>
+              <w:right w:type="dxa" w:w="120"/>
+            </w:tcMar>
+          </w:tcPr>
+          <w:p>
+            <w:pPr>
+              <w:spacing w:line="276"/>
+            </w:pPr>
             <w:r>
               <w:rPr>
                 <w:rFonts w:ascii="Calibri" w:cs="Calibri" w:eastAsia="Calibri" w:hAnsi="Calibri"/>
                 <w:b/>
                 <w:bCs/>
                 <w:color w:val="14181F"/>
-                <w:sz w:val="21"/>
-                <w:szCs w:val="21"/>
-              </w:rPr>
-              <w:t xml:space="preserve">Ответ</w:t>
+                <w:sz w:val="20"/>
+                <w:szCs w:val="20"/>
+              </w:rPr>
+              <w:t xml:space="preserve">Чем отличаются роли ИБ Администратор и Оператор ИБ? В описании написано так: Роль* — выберите «Администратор» (второй вариант — «Оператор ИБ», более узкие права).</w:t>
+            </w:r>
+          </w:p>
+        </w:tc>
+        <w:tc>
+          <w:tcPr>
+            <w:tcW w:type="dxa" w:w="4640"/>
+            <w:tcBorders>
+              <w:top w:val="single" w:color="999999" w:sz="4"/>
+              <w:left w:val="single" w:color="999999" w:sz="4"/>
+              <w:bottom w:val="single" w:color="999999" w:sz="4"/>
+              <w:right w:val="single" w:color="999999" w:sz="4"/>
+            </w:tcBorders>
+            <w:shd w:fill="F4F6FB" w:val="clear"/>
+            <w:tcMar>
+              <w:top w:type="dxa" w:w="90"/>
+              <w:left w:type="dxa" w:w="120"/>
+              <w:bottom w:type="dxa" w:w="90"/>
+              <w:right w:type="dxa" w:w="120"/>
+            </w:tcMar>
+          </w:tcPr>
+          <w:p>
+            <w:pPr>
+              <w:spacing w:line="276"/>
+            </w:pPr>
+            <w:r>
+              <w:rPr>
+                <w:rFonts w:ascii="Calibri" w:cs="Calibri" w:eastAsia="Calibri" w:hAnsi="Calibri"/>
+                <w:color w:val="1A1A1A"/>
+                <w:sz w:val="20"/>
+                <w:szCs w:val="20"/>
+              </w:rPr>
+              <w:t xml:space="preserve">Оператор ИБ не может править пользователей ИБ и настройки безопасности. Администратор — может.</w:t>
             </w:r>
           </w:p>
         </w:tc>
       </w:tr>
       <w:tr>
-        <w:tc>
-          <w:tcPr>
-            <w:tcW w:type="dxa" w:w="4300"/>
-            <w:tcBorders>
-              <w:top w:val="single" w:color="999999" w:sz="4"/>
-              <w:left w:val="single" w:color="999999" w:sz="4"/>
-              <w:bottom w:val="single" w:color="999999" w:sz="4"/>
-              <w:right w:val="single" w:color="999999" w:sz="4"/>
-            </w:tcBorders>
+        <w:trPr>
+          <w:cantSplit/>
+        </w:trPr>
+        <w:tc>
+          <w:tcPr>
+            <w:tcW w:type="dxa" w:w="460"/>
+            <w:tcBorders>
+              <w:top w:val="single" w:color="999999" w:sz="4"/>
+              <w:left w:val="single" w:color="999999" w:sz="4"/>
+              <w:bottom w:val="single" w:color="999999" w:sz="4"/>
+              <w:right w:val="single" w:color="999999" w:sz="4"/>
+            </w:tcBorders>
+            <w:shd w:fill="FFFFFF" w:val="clear"/>
+            <w:tcMar>
+              <w:top w:type="dxa" w:w="90"/>
+              <w:left w:type="dxa" w:w="120"/>
+              <w:bottom w:type="dxa" w:w="90"/>
+              <w:right w:type="dxa" w:w="120"/>
+            </w:tcMar>
+          </w:tcPr>
+          <w:p>
+            <w:r>
+              <w:rPr>
+                <w:rFonts w:ascii="Calibri" w:cs="Calibri" w:eastAsia="Calibri" w:hAnsi="Calibri"/>
+                <w:color w:val="555555"/>
+                <w:sz w:val="20"/>
+                <w:szCs w:val="20"/>
+              </w:rPr>
+              <w:t xml:space="preserve">3</w:t>
+            </w:r>
+          </w:p>
+        </w:tc>
+        <w:tc>
+          <w:tcPr>
+            <w:tcW w:type="dxa" w:w="4200"/>
+            <w:tcBorders>
+              <w:top w:val="single" w:color="999999" w:sz="4"/>
+              <w:left w:val="single" w:color="999999" w:sz="4"/>
+              <w:bottom w:val="single" w:color="999999" w:sz="4"/>
+              <w:right w:val="single" w:color="999999" w:sz="4"/>
+            </w:tcBorders>
+            <w:shd w:fill="FFFFFF" w:val="clear"/>
             <w:tcMar>
               <w:top w:type="dxa" w:w="90"/>
               <w:left w:type="dxa" w:w="120"/>
@@ -142,19 +410,20 @@
                 <w:sz w:val="20"/>
                 <w:szCs w:val="20"/>
               </w:rPr>
-              <w:t xml:space="preserve">Как сделать доступ для ИБ-шников с возможностью работать с настройками анонимизатора без возможности работать с прочими настройками, типа источников данных, лимитов и т.п.?</w:t>
-            </w:r>
-          </w:p>
-        </w:tc>
-        <w:tc>
-          <w:tcPr>
-            <w:tcW w:type="dxa" w:w="5000"/>
-            <w:tcBorders>
-              <w:top w:val="single" w:color="999999" w:sz="4"/>
-              <w:left w:val="single" w:color="999999" w:sz="4"/>
-              <w:bottom w:val="single" w:color="999999" w:sz="4"/>
-              <w:right w:val="single" w:color="999999" w:sz="4"/>
-            </w:tcBorders>
+              <w:t xml:space="preserve">Как в админке перевести пользователя из категории "Пользователь" в "Админстраторы"?</w:t>
+            </w:r>
+          </w:p>
+        </w:tc>
+        <w:tc>
+          <w:tcPr>
+            <w:tcW w:type="dxa" w:w="4640"/>
+            <w:tcBorders>
+              <w:top w:val="single" w:color="999999" w:sz="4"/>
+              <w:left w:val="single" w:color="999999" w:sz="4"/>
+              <w:bottom w:val="single" w:color="999999" w:sz="4"/>
+              <w:right w:val="single" w:color="999999" w:sz="4"/>
+            </w:tcBorders>
+            <w:shd w:fill="FFFFFF" w:val="clear"/>
             <w:tcMar>
               <w:top w:type="dxa" w:w="90"/>
               <w:left w:type="dxa" w:w="120"/>
@@ -173,21 +442,54 @@
                 <w:sz w:val="20"/>
                 <w:szCs w:val="20"/>
               </w:rPr>
-              <w:t xml:space="preserve">Через роль «Оператор ИБ» в «Сотрудники ИБ»: она не даёт менять сотрудников ИБ и настройки безопасности. Уточнить у команды платформы, входят ли в «настройки безопасности» и экраны анонимизатора (Regex-паттерны, Блэклист ОМ) — от этого зависит, подходит ли эта роль.</w:t>
+              <w:t xml:space="preserve">Просто дать роль админа — зайти в Каталог и прописать пользователя в разделе «Админ».</w:t>
             </w:r>
           </w:p>
         </w:tc>
       </w:tr>
       <w:tr>
-        <w:tc>
-          <w:tcPr>
-            <w:tcW w:type="dxa" w:w="4300"/>
-            <w:tcBorders>
-              <w:top w:val="single" w:color="999999" w:sz="4"/>
-              <w:left w:val="single" w:color="999999" w:sz="4"/>
-              <w:bottom w:val="single" w:color="999999" w:sz="4"/>
-              <w:right w:val="single" w:color="999999" w:sz="4"/>
-            </w:tcBorders>
+        <w:trPr>
+          <w:cantSplit/>
+        </w:trPr>
+        <w:tc>
+          <w:tcPr>
+            <w:tcW w:type="dxa" w:w="460"/>
+            <w:tcBorders>
+              <w:top w:val="single" w:color="999999" w:sz="4"/>
+              <w:left w:val="single" w:color="999999" w:sz="4"/>
+              <w:bottom w:val="single" w:color="999999" w:sz="4"/>
+              <w:right w:val="single" w:color="999999" w:sz="4"/>
+            </w:tcBorders>
+            <w:shd w:fill="F4F6FB" w:val="clear"/>
+            <w:tcMar>
+              <w:top w:type="dxa" w:w="90"/>
+              <w:left w:type="dxa" w:w="120"/>
+              <w:bottom w:type="dxa" w:w="90"/>
+              <w:right w:type="dxa" w:w="120"/>
+            </w:tcMar>
+          </w:tcPr>
+          <w:p>
+            <w:r>
+              <w:rPr>
+                <w:rFonts w:ascii="Calibri" w:cs="Calibri" w:eastAsia="Calibri" w:hAnsi="Calibri"/>
+                <w:color w:val="555555"/>
+                <w:sz w:val="20"/>
+                <w:szCs w:val="20"/>
+              </w:rPr>
+              <w:t xml:space="preserve">4</w:t>
+            </w:r>
+          </w:p>
+        </w:tc>
+        <w:tc>
+          <w:tcPr>
+            <w:tcW w:type="dxa" w:w="4200"/>
+            <w:tcBorders>
+              <w:top w:val="single" w:color="999999" w:sz="4"/>
+              <w:left w:val="single" w:color="999999" w:sz="4"/>
+              <w:bottom w:val="single" w:color="999999" w:sz="4"/>
+              <w:right w:val="single" w:color="999999" w:sz="4"/>
+            </w:tcBorders>
+            <w:shd w:fill="F4F6FB" w:val="clear"/>
             <w:tcMar>
               <w:top w:type="dxa" w:w="90"/>
               <w:left w:type="dxa" w:w="120"/>
@@ -208,19 +510,20 @@
                 <w:sz w:val="20"/>
                 <w:szCs w:val="20"/>
               </w:rPr>
-              <w:t xml:space="preserve">Чем отличаются роли ИБ Администратор и Оператор ИБ? В описании написано так: Роль* — выберите «Администратор» (второй вариант — «Оператор ИБ», более узкие права).</w:t>
-            </w:r>
-          </w:p>
-        </w:tc>
-        <w:tc>
-          <w:tcPr>
-            <w:tcW w:type="dxa" w:w="5000"/>
-            <w:tcBorders>
-              <w:top w:val="single" w:color="999999" w:sz="4"/>
-              <w:left w:val="single" w:color="999999" w:sz="4"/>
-              <w:bottom w:val="single" w:color="999999" w:sz="4"/>
-              <w:right w:val="single" w:color="999999" w:sz="4"/>
-            </w:tcBorders>
+              <w:t xml:space="preserve">Через какое-то время бездействия (?) в интерфейсе чата приложение переходит на URL https://app.local:8080/</w:t>
+            </w:r>
+          </w:p>
+        </w:tc>
+        <w:tc>
+          <w:tcPr>
+            <w:tcW w:type="dxa" w:w="4640"/>
+            <w:tcBorders>
+              <w:top w:val="single" w:color="999999" w:sz="4"/>
+              <w:left w:val="single" w:color="999999" w:sz="4"/>
+              <w:bottom w:val="single" w:color="999999" w:sz="4"/>
+              <w:right w:val="single" w:color="999999" w:sz="4"/>
+            </w:tcBorders>
+            <w:shd w:fill="F4F6FB" w:val="clear"/>
             <w:tcMar>
               <w:top w:type="dxa" w:w="90"/>
               <w:left w:type="dxa" w:w="120"/>
@@ -239,21 +542,54 @@
                 <w:sz w:val="20"/>
                 <w:szCs w:val="20"/>
               </w:rPr>
-              <w:t xml:space="preserve">Оператор ИБ не может править пользователей ИБ и настройки безопасности. Администратор — может.</w:t>
+              <w:t xml:space="preserve">Известная проблема — будет исправлено.</w:t>
             </w:r>
           </w:p>
         </w:tc>
       </w:tr>
       <w:tr>
-        <w:tc>
-          <w:tcPr>
-            <w:tcW w:type="dxa" w:w="4300"/>
-            <w:tcBorders>
-              <w:top w:val="single" w:color="999999" w:sz="4"/>
-              <w:left w:val="single" w:color="999999" w:sz="4"/>
-              <w:bottom w:val="single" w:color="999999" w:sz="4"/>
-              <w:right w:val="single" w:color="999999" w:sz="4"/>
-            </w:tcBorders>
+        <w:trPr>
+          <w:cantSplit/>
+        </w:trPr>
+        <w:tc>
+          <w:tcPr>
+            <w:tcW w:type="dxa" w:w="460"/>
+            <w:tcBorders>
+              <w:top w:val="single" w:color="999999" w:sz="4"/>
+              <w:left w:val="single" w:color="999999" w:sz="4"/>
+              <w:bottom w:val="single" w:color="999999" w:sz="4"/>
+              <w:right w:val="single" w:color="999999" w:sz="4"/>
+            </w:tcBorders>
+            <w:shd w:fill="FFFFFF" w:val="clear"/>
+            <w:tcMar>
+              <w:top w:type="dxa" w:w="90"/>
+              <w:left w:type="dxa" w:w="120"/>
+              <w:bottom w:type="dxa" w:w="90"/>
+              <w:right w:type="dxa" w:w="120"/>
+            </w:tcMar>
+          </w:tcPr>
+          <w:p>
+            <w:r>
+              <w:rPr>
+                <w:rFonts w:ascii="Calibri" w:cs="Calibri" w:eastAsia="Calibri" w:hAnsi="Calibri"/>
+                <w:color w:val="555555"/>
+                <w:sz w:val="20"/>
+                <w:szCs w:val="20"/>
+              </w:rPr>
+              <w:t xml:space="preserve">5</w:t>
+            </w:r>
+          </w:p>
+        </w:tc>
+        <w:tc>
+          <w:tcPr>
+            <w:tcW w:type="dxa" w:w="4200"/>
+            <w:tcBorders>
+              <w:top w:val="single" w:color="999999" w:sz="4"/>
+              <w:left w:val="single" w:color="999999" w:sz="4"/>
+              <w:bottom w:val="single" w:color="999999" w:sz="4"/>
+              <w:right w:val="single" w:color="999999" w:sz="4"/>
+            </w:tcBorders>
+            <w:shd w:fill="FFFFFF" w:val="clear"/>
             <w:tcMar>
               <w:top w:type="dxa" w:w="90"/>
               <w:left w:type="dxa" w:w="120"/>
@@ -274,19 +610,20 @@
                 <w:sz w:val="20"/>
                 <w:szCs w:val="20"/>
               </w:rPr>
-              <w:t xml:space="preserve">Как в админке перевести пользователя из категории "Пользователь" в "Админстраторы"?</w:t>
-            </w:r>
-          </w:p>
-        </w:tc>
-        <w:tc>
-          <w:tcPr>
-            <w:tcW w:type="dxa" w:w="5000"/>
-            <w:tcBorders>
-              <w:top w:val="single" w:color="999999" w:sz="4"/>
-              <w:left w:val="single" w:color="999999" w:sz="4"/>
-              <w:bottom w:val="single" w:color="999999" w:sz="4"/>
-              <w:right w:val="single" w:color="999999" w:sz="4"/>
-            </w:tcBorders>
+              <w:t xml:space="preserve">Кстати, корп. цвета d8 в дизайне отвалились. Но это не страшно, оставьте в дефолтной раскраске.</w:t>
+            </w:r>
+          </w:p>
+        </w:tc>
+        <w:tc>
+          <w:tcPr>
+            <w:tcW w:type="dxa" w:w="4640"/>
+            <w:tcBorders>
+              <w:top w:val="single" w:color="999999" w:sz="4"/>
+              <w:left w:val="single" w:color="999999" w:sz="4"/>
+              <w:bottom w:val="single" w:color="999999" w:sz="4"/>
+              <w:right w:val="single" w:color="999999" w:sz="4"/>
+            </w:tcBorders>
+            <w:shd w:fill="FFFFFF" w:val="clear"/>
             <w:tcMar>
               <w:top w:type="dxa" w:w="90"/>
               <w:left w:type="dxa" w:w="120"/>
@@ -305,21 +642,54 @@
                 <w:sz w:val="20"/>
                 <w:szCs w:val="20"/>
               </w:rPr>
-              <w:t xml:space="preserve">Просто дать роль админа.</w:t>
+              <w:t xml:space="preserve">Оставляем пока дефолтную раскраску.</w:t>
             </w:r>
           </w:p>
         </w:tc>
       </w:tr>
       <w:tr>
-        <w:tc>
-          <w:tcPr>
-            <w:tcW w:type="dxa" w:w="4300"/>
-            <w:tcBorders>
-              <w:top w:val="single" w:color="999999" w:sz="4"/>
-              <w:left w:val="single" w:color="999999" w:sz="4"/>
-              <w:bottom w:val="single" w:color="999999" w:sz="4"/>
-              <w:right w:val="single" w:color="999999" w:sz="4"/>
-            </w:tcBorders>
+        <w:trPr>
+          <w:cantSplit/>
+        </w:trPr>
+        <w:tc>
+          <w:tcPr>
+            <w:tcW w:type="dxa" w:w="460"/>
+            <w:tcBorders>
+              <w:top w:val="single" w:color="999999" w:sz="4"/>
+              <w:left w:val="single" w:color="999999" w:sz="4"/>
+              <w:bottom w:val="single" w:color="999999" w:sz="4"/>
+              <w:right w:val="single" w:color="999999" w:sz="4"/>
+            </w:tcBorders>
+            <w:shd w:fill="F4F6FB" w:val="clear"/>
+            <w:tcMar>
+              <w:top w:type="dxa" w:w="90"/>
+              <w:left w:type="dxa" w:w="120"/>
+              <w:bottom w:type="dxa" w:w="90"/>
+              <w:right w:type="dxa" w:w="120"/>
+            </w:tcMar>
+          </w:tcPr>
+          <w:p>
+            <w:r>
+              <w:rPr>
+                <w:rFonts w:ascii="Calibri" w:cs="Calibri" w:eastAsia="Calibri" w:hAnsi="Calibri"/>
+                <w:color w:val="555555"/>
+                <w:sz w:val="20"/>
+                <w:szCs w:val="20"/>
+              </w:rPr>
+              <w:t xml:space="preserve">6</w:t>
+            </w:r>
+          </w:p>
+        </w:tc>
+        <w:tc>
+          <w:tcPr>
+            <w:tcW w:type="dxa" w:w="4200"/>
+            <w:tcBorders>
+              <w:top w:val="single" w:color="999999" w:sz="4"/>
+              <w:left w:val="single" w:color="999999" w:sz="4"/>
+              <w:bottom w:val="single" w:color="999999" w:sz="4"/>
+              <w:right w:val="single" w:color="999999" w:sz="4"/>
+            </w:tcBorders>
+            <w:shd w:fill="F4F6FB" w:val="clear"/>
             <w:tcMar>
               <w:top w:type="dxa" w:w="90"/>
               <w:left w:type="dxa" w:w="120"/>
@@ -340,19 +710,20 @@
                 <w:sz w:val="20"/>
                 <w:szCs w:val="20"/>
               </w:rPr>
-              <w:t xml:space="preserve">Через какое-то время бездействия (?) в интерфейсе чата приложение переходит на URL https://app.local:8080/</w:t>
-            </w:r>
-          </w:p>
-        </w:tc>
-        <w:tc>
-          <w:tcPr>
-            <w:tcW w:type="dxa" w:w="5000"/>
-            <w:tcBorders>
-              <w:top w:val="single" w:color="999999" w:sz="4"/>
-              <w:left w:val="single" w:color="999999" w:sz="4"/>
-              <w:bottom w:val="single" w:color="999999" w:sz="4"/>
-              <w:right w:val="single" w:color="999999" w:sz="4"/>
-            </w:tcBorders>
+              <w:t xml:space="preserve">Как настроить модель по умолчанию? В чате модель регулярно слетает на первую из списка.</w:t>
+            </w:r>
+          </w:p>
+        </w:tc>
+        <w:tc>
+          <w:tcPr>
+            <w:tcW w:type="dxa" w:w="4640"/>
+            <w:tcBorders>
+              <w:top w:val="single" w:color="999999" w:sz="4"/>
+              <w:left w:val="single" w:color="999999" w:sz="4"/>
+              <w:bottom w:val="single" w:color="999999" w:sz="4"/>
+              <w:right w:val="single" w:color="999999" w:sz="4"/>
+            </w:tcBorders>
+            <w:shd w:fill="F4F6FB" w:val="clear"/>
             <w:tcMar>
               <w:top w:type="dxa" w:w="90"/>
               <w:left w:type="dxa" w:w="120"/>
@@ -371,21 +742,54 @@
                 <w:sz w:val="20"/>
                 <w:szCs w:val="20"/>
               </w:rPr>
-              <w:t xml:space="preserve">Похоже на баг конфигурации — незаменённый dev-адрес вместо реального домена стенда. Зафиксировать и передать команде платформы.</w:t>
+              <w:t xml:space="preserve">Берём в реализацию.</w:t>
             </w:r>
           </w:p>
         </w:tc>
       </w:tr>
       <w:tr>
-        <w:tc>
-          <w:tcPr>
-            <w:tcW w:type="dxa" w:w="4300"/>
-            <w:tcBorders>
-              <w:top w:val="single" w:color="999999" w:sz="4"/>
-              <w:left w:val="single" w:color="999999" w:sz="4"/>
-              <w:bottom w:val="single" w:color="999999" w:sz="4"/>
-              <w:right w:val="single" w:color="999999" w:sz="4"/>
-            </w:tcBorders>
+        <w:trPr>
+          <w:cantSplit/>
+        </w:trPr>
+        <w:tc>
+          <w:tcPr>
+            <w:tcW w:type="dxa" w:w="460"/>
+            <w:tcBorders>
+              <w:top w:val="single" w:color="999999" w:sz="4"/>
+              <w:left w:val="single" w:color="999999" w:sz="4"/>
+              <w:bottom w:val="single" w:color="999999" w:sz="4"/>
+              <w:right w:val="single" w:color="999999" w:sz="4"/>
+            </w:tcBorders>
+            <w:shd w:fill="FFFFFF" w:val="clear"/>
+            <w:tcMar>
+              <w:top w:type="dxa" w:w="90"/>
+              <w:left w:type="dxa" w:w="120"/>
+              <w:bottom w:type="dxa" w:w="90"/>
+              <w:right w:type="dxa" w:w="120"/>
+            </w:tcMar>
+          </w:tcPr>
+          <w:p>
+            <w:r>
+              <w:rPr>
+                <w:rFonts w:ascii="Calibri" w:cs="Calibri" w:eastAsia="Calibri" w:hAnsi="Calibri"/>
+                <w:color w:val="555555"/>
+                <w:sz w:val="20"/>
+                <w:szCs w:val="20"/>
+              </w:rPr>
+              <w:t xml:space="preserve">7</w:t>
+            </w:r>
+          </w:p>
+        </w:tc>
+        <w:tc>
+          <w:tcPr>
+            <w:tcW w:type="dxa" w:w="4200"/>
+            <w:tcBorders>
+              <w:top w:val="single" w:color="999999" w:sz="4"/>
+              <w:left w:val="single" w:color="999999" w:sz="4"/>
+              <w:bottom w:val="single" w:color="999999" w:sz="4"/>
+              <w:right w:val="single" w:color="999999" w:sz="4"/>
+            </w:tcBorders>
+            <w:shd w:fill="FFFFFF" w:val="clear"/>
             <w:tcMar>
               <w:top w:type="dxa" w:w="90"/>
               <w:left w:type="dxa" w:w="120"/>
@@ -406,19 +810,20 @@
                 <w:sz w:val="20"/>
                 <w:szCs w:val="20"/>
               </w:rPr>
-              <w:t xml:space="preserve">Кстати, корп. цвета d8 в дизайне отвалились. Но это не страшно, оставьте в дефолтной раскраске.</w:t>
-            </w:r>
-          </w:p>
-        </w:tc>
-        <w:tc>
-          <w:tcPr>
-            <w:tcW w:type="dxa" w:w="5000"/>
-            <w:tcBorders>
-              <w:top w:val="single" w:color="999999" w:sz="4"/>
-              <w:left w:val="single" w:color="999999" w:sz="4"/>
-              <w:bottom w:val="single" w:color="999999" w:sz="4"/>
-              <w:right w:val="single" w:color="999999" w:sz="4"/>
-            </w:tcBorders>
+              <w:t xml:space="preserve">Можно ли показать список базовых маскированных элементов?</w:t>
+            </w:r>
+          </w:p>
+        </w:tc>
+        <w:tc>
+          <w:tcPr>
+            <w:tcW w:type="dxa" w:w="4640"/>
+            <w:tcBorders>
+              <w:top w:val="single" w:color="999999" w:sz="4"/>
+              <w:left w:val="single" w:color="999999" w:sz="4"/>
+              <w:bottom w:val="single" w:color="999999" w:sz="4"/>
+              <w:right w:val="single" w:color="999999" w:sz="4"/>
+            </w:tcBorders>
+            <w:shd w:fill="FFFFFF" w:val="clear"/>
             <w:tcMar>
               <w:top w:type="dxa" w:w="90"/>
               <w:left w:type="dxa" w:w="120"/>
@@ -437,139 +842,7 @@
                 <w:sz w:val="20"/>
                 <w:szCs w:val="20"/>
               </w:rPr>
-              <w:t xml:space="preserve">Принято — оставляем дефолтную раскраску, действий не требуется.</w:t>
-            </w:r>
-          </w:p>
-        </w:tc>
-      </w:tr>
-      <w:tr>
-        <w:tc>
-          <w:tcPr>
-            <w:tcW w:type="dxa" w:w="4300"/>
-            <w:tcBorders>
-              <w:top w:val="single" w:color="999999" w:sz="4"/>
-              <w:left w:val="single" w:color="999999" w:sz="4"/>
-              <w:bottom w:val="single" w:color="999999" w:sz="4"/>
-              <w:right w:val="single" w:color="999999" w:sz="4"/>
-            </w:tcBorders>
-            <w:tcMar>
-              <w:top w:type="dxa" w:w="90"/>
-              <w:left w:type="dxa" w:w="120"/>
-              <w:bottom w:type="dxa" w:w="90"/>
-              <w:right w:type="dxa" w:w="120"/>
-            </w:tcMar>
-          </w:tcPr>
-          <w:p>
-            <w:pPr>
-              <w:spacing w:line="276"/>
-            </w:pPr>
-            <w:r>
-              <w:rPr>
-                <w:rFonts w:ascii="Calibri" w:cs="Calibri" w:eastAsia="Calibri" w:hAnsi="Calibri"/>
-                <w:b/>
-                <w:bCs/>
-                <w:color w:val="14181F"/>
-                <w:sz w:val="20"/>
-                <w:szCs w:val="20"/>
-              </w:rPr>
-              <w:t xml:space="preserve">Как настроить модель по умолчанию? В чате модель регулярно слетает на первую из списка.</w:t>
-            </w:r>
-          </w:p>
-        </w:tc>
-        <w:tc>
-          <w:tcPr>
-            <w:tcW w:type="dxa" w:w="5000"/>
-            <w:tcBorders>
-              <w:top w:val="single" w:color="999999" w:sz="4"/>
-              <w:left w:val="single" w:color="999999" w:sz="4"/>
-              <w:bottom w:val="single" w:color="999999" w:sz="4"/>
-              <w:right w:val="single" w:color="999999" w:sz="4"/>
-            </w:tcBorders>
-            <w:tcMar>
-              <w:top w:type="dxa" w:w="90"/>
-              <w:left w:type="dxa" w:w="120"/>
-              <w:bottom w:type="dxa" w:w="90"/>
-              <w:right w:type="dxa" w:w="120"/>
-            </w:tcMar>
-          </w:tcPr>
-          <w:p>
-            <w:pPr>
-              <w:spacing w:line="276"/>
-            </w:pPr>
-            <w:r>
-              <w:rPr>
-                <w:rFonts w:ascii="Calibri" w:cs="Calibri" w:eastAsia="Calibri" w:hAnsi="Calibri"/>
-                <w:color w:val="1A1A1A"/>
-                <w:sz w:val="20"/>
-                <w:szCs w:val="20"/>
-              </w:rPr>
-              <w:t xml:space="preserve">Это в новой версии уже есть, скоро будет опубликовано.</w:t>
-            </w:r>
-          </w:p>
-        </w:tc>
-      </w:tr>
-      <w:tr>
-        <w:tc>
-          <w:tcPr>
-            <w:tcW w:type="dxa" w:w="4300"/>
-            <w:tcBorders>
-              <w:top w:val="single" w:color="999999" w:sz="4"/>
-              <w:left w:val="single" w:color="999999" w:sz="4"/>
-              <w:bottom w:val="single" w:color="999999" w:sz="4"/>
-              <w:right w:val="single" w:color="999999" w:sz="4"/>
-            </w:tcBorders>
-            <w:tcMar>
-              <w:top w:type="dxa" w:w="90"/>
-              <w:left w:type="dxa" w:w="120"/>
-              <w:bottom w:type="dxa" w:w="90"/>
-              <w:right w:type="dxa" w:w="120"/>
-            </w:tcMar>
-          </w:tcPr>
-          <w:p>
-            <w:pPr>
-              <w:spacing w:line="276"/>
-            </w:pPr>
-            <w:r>
-              <w:rPr>
-                <w:rFonts w:ascii="Calibri" w:cs="Calibri" w:eastAsia="Calibri" w:hAnsi="Calibri"/>
-                <w:b/>
-                <w:bCs/>
-                <w:color w:val="14181F"/>
-                <w:sz w:val="20"/>
-                <w:szCs w:val="20"/>
-              </w:rPr>
-              <w:t xml:space="preserve">Можно ли показать список базовых маскированных элементов?</w:t>
-            </w:r>
-          </w:p>
-        </w:tc>
-        <w:tc>
-          <w:tcPr>
-            <w:tcW w:type="dxa" w:w="5000"/>
-            <w:tcBorders>
-              <w:top w:val="single" w:color="999999" w:sz="4"/>
-              <w:left w:val="single" w:color="999999" w:sz="4"/>
-              <w:bottom w:val="single" w:color="999999" w:sz="4"/>
-              <w:right w:val="single" w:color="999999" w:sz="4"/>
-            </w:tcBorders>
-            <w:tcMar>
-              <w:top w:type="dxa" w:w="90"/>
-              <w:left w:type="dxa" w:w="120"/>
-              <w:bottom w:type="dxa" w:w="90"/>
-              <w:right w:type="dxa" w:w="120"/>
-            </w:tcMar>
-          </w:tcPr>
-          <w:p>
-            <w:pPr>
-              <w:spacing w:line="276"/>
-            </w:pPr>
-            <w:r>
-              <w:rPr>
-                <w:rFonts w:ascii="Calibri" w:cs="Calibri" w:eastAsia="Calibri" w:hAnsi="Calibri"/>
-                <w:color w:val="1A1A1A"/>
-                <w:sz w:val="20"/>
-                <w:szCs w:val="20"/>
-              </w:rPr>
-              <w:t xml:space="preserve">Да, но для этого нужно выполнить изменения в системе.</w:t>
+              <w:t xml:space="preserve">Да, но потребуются изменения в системе — берём в разработку.</w:t>
             </w:r>
           </w:p>
         </w:tc>

</xml_diff>

<commit_message>
Add custom mask-token prefix, LDAP/local auth, and multi-domain questions
Three new rows in the Q&A table: renaming [CUSTOM_N] to a custom
prefix like [AGREEMENT_N] requires a CustomPIIType config change by
the platform team (UI token-type list is closed); Catalog login is a
single AUTHENTICATION_PROVIDER switch (ldap or basic, never both) with
a separate break-glass password for the ИБ admin panel that's
independent of it — if truly neither works that's a config fault, not
by design; multi-domain AD auth isn't supported by the documented
config (single LDAP host/base DN/principal domain). Folded the
LDAP/domain facts into administrirovanie-polzovateli.md.
</commit_message>
<xml_diff>
--- a/docs/platform/voprosy-otvety-tablica.docx
+++ b/docs/platform/voprosy-otvety-tablica.docx
@@ -843,6 +843,306 @@
                 <w:szCs w:val="20"/>
               </w:rPr>
               <w:t xml:space="preserve">Да, но потребуются изменения в системе — берём в разработку.</w:t>
+            </w:r>
+          </w:p>
+        </w:tc>
+      </w:tr>
+      <w:tr>
+        <w:trPr>
+          <w:cantSplit/>
+        </w:trPr>
+        <w:tc>
+          <w:tcPr>
+            <w:tcW w:type="dxa" w:w="460"/>
+            <w:tcBorders>
+              <w:top w:val="single" w:color="999999" w:sz="4"/>
+              <w:left w:val="single" w:color="999999" w:sz="4"/>
+              <w:bottom w:val="single" w:color="999999" w:sz="4"/>
+              <w:right w:val="single" w:color="999999" w:sz="4"/>
+            </w:tcBorders>
+            <w:shd w:fill="F4F6FB" w:val="clear"/>
+            <w:tcMar>
+              <w:top w:type="dxa" w:w="90"/>
+              <w:left w:type="dxa" w:w="120"/>
+              <w:bottom w:type="dxa" w:w="90"/>
+              <w:right w:type="dxa" w:w="120"/>
+            </w:tcMar>
+          </w:tcPr>
+          <w:p>
+            <w:r>
+              <w:rPr>
+                <w:rFonts w:ascii="Calibri" w:cs="Calibri" w:eastAsia="Calibri" w:hAnsi="Calibri"/>
+                <w:color w:val="555555"/>
+                <w:sz w:val="20"/>
+                <w:szCs w:val="20"/>
+              </w:rPr>
+              <w:t xml:space="preserve">8</w:t>
+            </w:r>
+          </w:p>
+        </w:tc>
+        <w:tc>
+          <w:tcPr>
+            <w:tcW w:type="dxa" w:w="4200"/>
+            <w:tcBorders>
+              <w:top w:val="single" w:color="999999" w:sz="4"/>
+              <w:left w:val="single" w:color="999999" w:sz="4"/>
+              <w:bottom w:val="single" w:color="999999" w:sz="4"/>
+              <w:right w:val="single" w:color="999999" w:sz="4"/>
+            </w:tcBorders>
+            <w:shd w:fill="F4F6FB" w:val="clear"/>
+            <w:tcMar>
+              <w:top w:type="dxa" w:w="90"/>
+              <w:left w:type="dxa" w:w="120"/>
+              <w:bottom w:type="dxa" w:w="90"/>
+              <w:right w:type="dxa" w:w="120"/>
+            </w:tcMar>
+          </w:tcPr>
+          <w:p>
+            <w:pPr>
+              <w:spacing w:line="276"/>
+            </w:pPr>
+            <w:r>
+              <w:rPr>
+                <w:rFonts w:ascii="Calibri" w:cs="Calibri" w:eastAsia="Calibri" w:hAnsi="Calibri"/>
+                <w:b/>
+                <w:bCs/>
+                <w:color w:val="14181F"/>
+                <w:sz w:val="20"/>
+                <w:szCs w:val="20"/>
+              </w:rPr>
+              <w:t xml:space="preserve">Как сделать так, чтобы переменная в протоколах была не [CUSTOM_6], а, например, [AGREEMENT_6]?</w:t>
+            </w:r>
+          </w:p>
+        </w:tc>
+        <w:tc>
+          <w:tcPr>
+            <w:tcW w:type="dxa" w:w="4640"/>
+            <w:tcBorders>
+              <w:top w:val="single" w:color="999999" w:sz="4"/>
+              <w:left w:val="single" w:color="999999" w:sz="4"/>
+              <w:bottom w:val="single" w:color="999999" w:sz="4"/>
+              <w:right w:val="single" w:color="999999" w:sz="4"/>
+            </w:tcBorders>
+            <w:shd w:fill="F4F6FB" w:val="clear"/>
+            <w:tcMar>
+              <w:top w:type="dxa" w:w="90"/>
+              <w:left w:type="dxa" w:w="120"/>
+              <w:bottom w:type="dxa" w:w="90"/>
+              <w:right w:type="dxa" w:w="120"/>
+            </w:tcMar>
+          </w:tcPr>
+          <w:p>
+            <w:pPr>
+              <w:spacing w:line="276"/>
+            </w:pPr>
+            <w:r>
+              <w:rPr>
+                <w:rFonts w:ascii="Calibri" w:cs="Calibri" w:eastAsia="Calibri" w:hAnsi="Calibri"/>
+                <w:color w:val="1A1A1A"/>
+                <w:sz w:val="20"/>
+                <w:szCs w:val="20"/>
+              </w:rPr>
+              <w:t xml:space="preserve">Через экран «Regex-паттерны» нельзя — тип токена там закрытый список (PERSON/PROJECT/COMPANY/PRODUCT/CUSTOM), свой префикс не вписать. Нужен отдельный CustomPIIType в обход UI, в конфиге pii_shield/config.py — это делает команда платформы.</w:t>
+            </w:r>
+          </w:p>
+        </w:tc>
+      </w:tr>
+      <w:tr>
+        <w:trPr>
+          <w:cantSplit/>
+        </w:trPr>
+        <w:tc>
+          <w:tcPr>
+            <w:tcW w:type="dxa" w:w="460"/>
+            <w:tcBorders>
+              <w:top w:val="single" w:color="999999" w:sz="4"/>
+              <w:left w:val="single" w:color="999999" w:sz="4"/>
+              <w:bottom w:val="single" w:color="999999" w:sz="4"/>
+              <w:right w:val="single" w:color="999999" w:sz="4"/>
+            </w:tcBorders>
+            <w:shd w:fill="FFFFFF" w:val="clear"/>
+            <w:tcMar>
+              <w:top w:type="dxa" w:w="90"/>
+              <w:left w:type="dxa" w:w="120"/>
+              <w:bottom w:type="dxa" w:w="90"/>
+              <w:right w:type="dxa" w:w="120"/>
+            </w:tcMar>
+          </w:tcPr>
+          <w:p>
+            <w:r>
+              <w:rPr>
+                <w:rFonts w:ascii="Calibri" w:cs="Calibri" w:eastAsia="Calibri" w:hAnsi="Calibri"/>
+                <w:color w:val="555555"/>
+                <w:sz w:val="20"/>
+                <w:szCs w:val="20"/>
+              </w:rPr>
+              <w:t xml:space="preserve">9</w:t>
+            </w:r>
+          </w:p>
+        </w:tc>
+        <w:tc>
+          <w:tcPr>
+            <w:tcW w:type="dxa" w:w="4200"/>
+            <w:tcBorders>
+              <w:top w:val="single" w:color="999999" w:sz="4"/>
+              <w:left w:val="single" w:color="999999" w:sz="4"/>
+              <w:bottom w:val="single" w:color="999999" w:sz="4"/>
+              <w:right w:val="single" w:color="999999" w:sz="4"/>
+            </w:tcBorders>
+            <w:shd w:fill="FFFFFF" w:val="clear"/>
+            <w:tcMar>
+              <w:top w:type="dxa" w:w="90"/>
+              <w:left w:type="dxa" w:w="120"/>
+              <w:bottom w:type="dxa" w:w="90"/>
+              <w:right w:type="dxa" w:w="120"/>
+            </w:tcMar>
+          </w:tcPr>
+          <w:p>
+            <w:pPr>
+              <w:spacing w:line="276"/>
+            </w:pPr>
+            <w:r>
+              <w:rPr>
+                <w:rFonts w:ascii="Calibri" w:cs="Calibri" w:eastAsia="Calibri" w:hAnsi="Calibri"/>
+                <w:b/>
+                <w:bCs/>
+                <w:color w:val="14181F"/>
+                <w:sz w:val="20"/>
+                <w:szCs w:val="20"/>
+              </w:rPr>
+              <w:t xml:space="preserve">Я правильно понимаю, что можно либо авторизовываться по ЛДАП, либо локально? Т.е. и так и так не работает?</w:t>
+            </w:r>
+          </w:p>
+        </w:tc>
+        <w:tc>
+          <w:tcPr>
+            <w:tcW w:type="dxa" w:w="4640"/>
+            <w:tcBorders>
+              <w:top w:val="single" w:color="999999" w:sz="4"/>
+              <w:left w:val="single" w:color="999999" w:sz="4"/>
+              <w:bottom w:val="single" w:color="999999" w:sz="4"/>
+              <w:right w:val="single" w:color="999999" w:sz="4"/>
+            </w:tcBorders>
+            <w:shd w:fill="FFFFFF" w:val="clear"/>
+            <w:tcMar>
+              <w:top w:type="dxa" w:w="90"/>
+              <w:left w:type="dxa" w:w="120"/>
+              <w:bottom w:type="dxa" w:w="90"/>
+              <w:right w:type="dxa" w:w="120"/>
+            </w:tcMar>
+          </w:tcPr>
+          <w:p>
+            <w:pPr>
+              <w:spacing w:line="276"/>
+            </w:pPr>
+            <w:r>
+              <w:rPr>
+                <w:rFonts w:ascii="Calibri" w:cs="Calibri" w:eastAsia="Calibri" w:hAnsi="Calibri"/>
+                <w:color w:val="1A1A1A"/>
+                <w:sz w:val="20"/>
+                <w:szCs w:val="20"/>
+              </w:rPr>
+              <w:t xml:space="preserve">Да, для входа в Каталог это именно либо/либо — один провайдер на всех (AUTHENTICATION_PROVIDER=ldap или basic), сразу оба не работают. У «Рабочего места ИБ» есть свой отдельный локальный break-glass пароль, не зависящий от этого переключателя. Если сейчас не работает вообще ничего — это не дизайн, а сбой, нужна отдельная диагностика (возможно, тот же баг, что и с редиректом на app.local:8080).</w:t>
+            </w:r>
+          </w:p>
+        </w:tc>
+      </w:tr>
+      <w:tr>
+        <w:trPr>
+          <w:cantSplit/>
+        </w:trPr>
+        <w:tc>
+          <w:tcPr>
+            <w:tcW w:type="dxa" w:w="460"/>
+            <w:tcBorders>
+              <w:top w:val="single" w:color="999999" w:sz="4"/>
+              <w:left w:val="single" w:color="999999" w:sz="4"/>
+              <w:bottom w:val="single" w:color="999999" w:sz="4"/>
+              <w:right w:val="single" w:color="999999" w:sz="4"/>
+            </w:tcBorders>
+            <w:shd w:fill="F4F6FB" w:val="clear"/>
+            <w:tcMar>
+              <w:top w:type="dxa" w:w="90"/>
+              <w:left w:type="dxa" w:w="120"/>
+              <w:bottom w:type="dxa" w:w="90"/>
+              <w:right w:type="dxa" w:w="120"/>
+            </w:tcMar>
+          </w:tcPr>
+          <w:p>
+            <w:r>
+              <w:rPr>
+                <w:rFonts w:ascii="Calibri" w:cs="Calibri" w:eastAsia="Calibri" w:hAnsi="Calibri"/>
+                <w:color w:val="555555"/>
+                <w:sz w:val="20"/>
+                <w:szCs w:val="20"/>
+              </w:rPr>
+              <w:t xml:space="preserve">10</w:t>
+            </w:r>
+          </w:p>
+        </w:tc>
+        <w:tc>
+          <w:tcPr>
+            <w:tcW w:type="dxa" w:w="4200"/>
+            <w:tcBorders>
+              <w:top w:val="single" w:color="999999" w:sz="4"/>
+              <w:left w:val="single" w:color="999999" w:sz="4"/>
+              <w:bottom w:val="single" w:color="999999" w:sz="4"/>
+              <w:right w:val="single" w:color="999999" w:sz="4"/>
+            </w:tcBorders>
+            <w:shd w:fill="F4F6FB" w:val="clear"/>
+            <w:tcMar>
+              <w:top w:type="dxa" w:w="90"/>
+              <w:left w:type="dxa" w:w="120"/>
+              <w:bottom w:type="dxa" w:w="90"/>
+              <w:right w:type="dxa" w:w="120"/>
+            </w:tcMar>
+          </w:tcPr>
+          <w:p>
+            <w:pPr>
+              <w:spacing w:line="276"/>
+            </w:pPr>
+            <w:r>
+              <w:rPr>
+                <w:rFonts w:ascii="Calibri" w:cs="Calibri" w:eastAsia="Calibri" w:hAnsi="Calibri"/>
+                <w:b/>
+                <w:bCs/>
+                <w:color w:val="14181F"/>
+                <w:sz w:val="20"/>
+                <w:szCs w:val="20"/>
+              </w:rPr>
+              <w:t xml:space="preserve">Сейчас можно настроить авторизацию для 2-х доменов?</w:t>
+            </w:r>
+          </w:p>
+        </w:tc>
+        <w:tc>
+          <w:tcPr>
+            <w:tcW w:type="dxa" w:w="4640"/>
+            <w:tcBorders>
+              <w:top w:val="single" w:color="999999" w:sz="4"/>
+              <w:left w:val="single" w:color="999999" w:sz="4"/>
+              <w:bottom w:val="single" w:color="999999" w:sz="4"/>
+              <w:right w:val="single" w:color="999999" w:sz="4"/>
+            </w:tcBorders>
+            <w:shd w:fill="F4F6FB" w:val="clear"/>
+            <w:tcMar>
+              <w:top w:type="dxa" w:w="90"/>
+              <w:left w:type="dxa" w:w="120"/>
+              <w:bottom w:type="dxa" w:w="90"/>
+              <w:right w:type="dxa" w:w="120"/>
+            </w:tcMar>
+          </w:tcPr>
+          <w:p>
+            <w:pPr>
+              <w:spacing w:line="276"/>
+            </w:pPr>
+            <w:r>
+              <w:rPr>
+                <w:rFonts w:ascii="Calibri" w:cs="Calibri" w:eastAsia="Calibri" w:hAnsi="Calibri"/>
+                <w:color w:val="1A1A1A"/>
+                <w:sz w:val="20"/>
+                <w:szCs w:val="20"/>
+              </w:rPr>
+              <w:t xml:space="preserve">По документации — нет, конфиг рассчитан на один AD-домен (один LDAP-хост, один base DN, один email-домен принципала). Мультидоменная авторизация потребует доработки от команды платформы.</w:t>
             </w:r>
           </w:p>
         </w:tc>

</xml_diff>

<commit_message>
Add a dev-tracking table for items taken into development
New table below the Q&A: the 4 items whose answer committed to work
(app.local:8080 redirect, default-model persistence, list of masked
elements, custom mask-token prefix), each with a status and a blank
deadline column to fill in. Also synced rows 8-10 of the main table to
the user's latest edits from the re-uploaded doc.
</commit_message>
<xml_diff>
--- a/docs/platform/voprosy-otvety-tablica.docx
+++ b/docs/platform/voprosy-otvety-tablica.docx
@@ -942,7 +942,7 @@
                 <w:sz w:val="20"/>
                 <w:szCs w:val="20"/>
               </w:rPr>
-              <w:t xml:space="preserve">Через экран «Regex-паттерны» нельзя — тип токена там закрытый список (PERSON/PROJECT/COMPANY/PRODUCT/CUSTOM), свой префикс не вписать. Нужен отдельный CustomPIIType в обход UI, в конфиге pii_shield/config.py — это делает команда платформы.</w:t>
+              <w:t xml:space="preserve">Через экран «Regex-паттерны» нельзя — тип токена там закрытый список (PERSON/PROJECT/COMPANY/PRODUCT/CUSTOM), свой префикс сейчас не вписать. Будем брать в разработку.</w:t>
             </w:r>
           </w:p>
         </w:tc>
@@ -1042,7 +1042,7 @@
                 <w:sz w:val="20"/>
                 <w:szCs w:val="20"/>
               </w:rPr>
-              <w:t xml:space="preserve">Да, для входа в Каталог это именно либо/либо — один провайдер на всех (AUTHENTICATION_PROVIDER=ldap или basic), сразу оба не работают. У «Рабочего места ИБ» есть свой отдельный локальный break-glass пароль, не зависящий от этого переключателя. Если сейчас не работает вообще ничего — это не дизайн, а сбой, нужна отдельная диагностика (возможно, тот же баг, что и с редиректом на app.local:8080).</w:t>
+              <w:t xml:space="preserve">Да, для входа в Каталог это именно либо/либо — один провайдер на всех.</w:t>
             </w:r>
           </w:p>
         </w:tc>
@@ -1142,7 +1142,528 @@
                 <w:sz w:val="20"/>
                 <w:szCs w:val="20"/>
               </w:rPr>
-              <w:t xml:space="preserve">По документации — нет, конфиг рассчитан на один AD-домен (один LDAP-хост, один base DN, один email-домен принципала). Мультидоменная авторизация потребует доработки от команды платформы.</w:t>
+              <w:t xml:space="preserve">По документации — нет, конфиг рассчитан на один AD-домен.</w:t>
+            </w:r>
+          </w:p>
+        </w:tc>
+      </w:tr>
+    </w:tbl>
+    <w:p>
+      <w:pPr>
+        <w:pStyle w:val="Heading1"/>
+        <w:spacing w:after="140" w:before="380"/>
+      </w:pPr>
+      <w:r>
+        <w:rPr>
+          <w:rFonts w:ascii="Calibri" w:cs="Calibri" w:eastAsia="Calibri" w:hAnsi="Calibri"/>
+          <w:b/>
+          <w:bCs/>
+          <w:color w:val="14181F"/>
+          <w:sz w:val="25"/>
+          <w:szCs w:val="25"/>
+        </w:rPr>
+        <w:t xml:space="preserve">Взято в разработку</w:t>
+      </w:r>
+    </w:p>
+    <w:tbl>
+      <w:tblPr>
+        <w:tblW w:type="dxa" w:w="9300"/>
+        <w:tblBorders>
+          <w:top w:val="single" w:color="auto" w:sz="4"/>
+          <w:left w:val="single" w:color="auto" w:sz="4"/>
+          <w:bottom w:val="single" w:color="auto" w:sz="4"/>
+          <w:right w:val="single" w:color="auto" w:sz="4"/>
+          <w:insideH w:val="single" w:color="auto" w:sz="4"/>
+          <w:insideV w:val="single" w:color="auto" w:sz="4"/>
+        </w:tblBorders>
+      </w:tblPr>
+      <w:tblGrid>
+        <w:gridCol w:w="4900"/>
+        <w:gridCol w:w="2300"/>
+        <w:gridCol w:w="2100"/>
+      </w:tblGrid>
+      <w:tr>
+        <w:trPr>
+          <w:tblHeader/>
+        </w:trPr>
+        <w:tc>
+          <w:tcPr>
+            <w:tcW w:type="dxa" w:w="4900"/>
+            <w:tcBorders>
+              <w:top w:val="single" w:color="999999" w:sz="4"/>
+              <w:left w:val="single" w:color="999999" w:sz="4"/>
+              <w:bottom w:val="single" w:color="999999" w:sz="4"/>
+              <w:right w:val="single" w:color="999999" w:sz="4"/>
+            </w:tcBorders>
+            <w:shd w:fill="3B5BDB" w:val="clear"/>
+            <w:tcMar>
+              <w:top w:type="dxa" w:w="90"/>
+              <w:left w:type="dxa" w:w="120"/>
+              <w:bottom w:type="dxa" w:w="90"/>
+              <w:right w:type="dxa" w:w="120"/>
+            </w:tcMar>
+          </w:tcPr>
+          <w:p>
+            <w:r>
+              <w:rPr>
+                <w:rFonts w:ascii="Calibri" w:cs="Calibri" w:eastAsia="Calibri" w:hAnsi="Calibri"/>
+                <w:b/>
+                <w:bCs/>
+                <w:color w:val="FFFFFF"/>
+                <w:sz w:val="21"/>
+                <w:szCs w:val="21"/>
+              </w:rPr>
+              <w:t xml:space="preserve">Пункт</w:t>
+            </w:r>
+          </w:p>
+        </w:tc>
+        <w:tc>
+          <w:tcPr>
+            <w:tcW w:type="dxa" w:w="2300"/>
+            <w:tcBorders>
+              <w:top w:val="single" w:color="999999" w:sz="4"/>
+              <w:left w:val="single" w:color="999999" w:sz="4"/>
+              <w:bottom w:val="single" w:color="999999" w:sz="4"/>
+              <w:right w:val="single" w:color="999999" w:sz="4"/>
+            </w:tcBorders>
+            <w:shd w:fill="3B5BDB" w:val="clear"/>
+            <w:tcMar>
+              <w:top w:type="dxa" w:w="90"/>
+              <w:left w:type="dxa" w:w="120"/>
+              <w:bottom w:type="dxa" w:w="90"/>
+              <w:right w:type="dxa" w:w="120"/>
+            </w:tcMar>
+          </w:tcPr>
+          <w:p>
+            <w:r>
+              <w:rPr>
+                <w:rFonts w:ascii="Calibri" w:cs="Calibri" w:eastAsia="Calibri" w:hAnsi="Calibri"/>
+                <w:b/>
+                <w:bCs/>
+                <w:color w:val="FFFFFF"/>
+                <w:sz w:val="21"/>
+                <w:szCs w:val="21"/>
+              </w:rPr>
+              <w:t xml:space="preserve">Статус</w:t>
+            </w:r>
+          </w:p>
+        </w:tc>
+        <w:tc>
+          <w:tcPr>
+            <w:tcW w:type="dxa" w:w="2100"/>
+            <w:tcBorders>
+              <w:top w:val="single" w:color="999999" w:sz="4"/>
+              <w:left w:val="single" w:color="999999" w:sz="4"/>
+              <w:bottom w:val="single" w:color="999999" w:sz="4"/>
+              <w:right w:val="single" w:color="999999" w:sz="4"/>
+            </w:tcBorders>
+            <w:shd w:fill="3B5BDB" w:val="clear"/>
+            <w:tcMar>
+              <w:top w:type="dxa" w:w="90"/>
+              <w:left w:type="dxa" w:w="120"/>
+              <w:bottom w:type="dxa" w:w="90"/>
+              <w:right w:type="dxa" w:w="120"/>
+            </w:tcMar>
+          </w:tcPr>
+          <w:p>
+            <w:r>
+              <w:rPr>
+                <w:rFonts w:ascii="Calibri" w:cs="Calibri" w:eastAsia="Calibri" w:hAnsi="Calibri"/>
+                <w:b/>
+                <w:bCs/>
+                <w:color w:val="FFFFFF"/>
+                <w:sz w:val="21"/>
+                <w:szCs w:val="21"/>
+              </w:rPr>
+              <w:t xml:space="preserve">Срок выполнения</w:t>
+            </w:r>
+          </w:p>
+        </w:tc>
+      </w:tr>
+      <w:tr>
+        <w:trPr>
+          <w:cantSplit/>
+        </w:trPr>
+        <w:tc>
+          <w:tcPr>
+            <w:tcW w:type="dxa" w:w="4900"/>
+            <w:tcBorders>
+              <w:top w:val="single" w:color="999999" w:sz="4"/>
+              <w:left w:val="single" w:color="999999" w:sz="4"/>
+              <w:bottom w:val="single" w:color="999999" w:sz="4"/>
+              <w:right w:val="single" w:color="999999" w:sz="4"/>
+            </w:tcBorders>
+            <w:shd w:fill="FFFFFF" w:val="clear"/>
+            <w:tcMar>
+              <w:top w:type="dxa" w:w="90"/>
+              <w:left w:type="dxa" w:w="120"/>
+              <w:bottom w:type="dxa" w:w="90"/>
+              <w:right w:type="dxa" w:w="120"/>
+            </w:tcMar>
+          </w:tcPr>
+          <w:p>
+            <w:pPr>
+              <w:spacing w:line="276"/>
+            </w:pPr>
+            <w:r>
+              <w:rPr>
+                <w:rFonts w:ascii="Calibri" w:cs="Calibri" w:eastAsia="Calibri" w:hAnsi="Calibri"/>
+                <w:color w:val="1A1A1A"/>
+                <w:sz w:val="20"/>
+                <w:szCs w:val="20"/>
+              </w:rPr>
+              <w:t xml:space="preserve">Редирект на app.local:8080 после бездействия в чате</w:t>
+            </w:r>
+          </w:p>
+        </w:tc>
+        <w:tc>
+          <w:tcPr>
+            <w:tcW w:type="dxa" w:w="2300"/>
+            <w:tcBorders>
+              <w:top w:val="single" w:color="999999" w:sz="4"/>
+              <w:left w:val="single" w:color="999999" w:sz="4"/>
+              <w:bottom w:val="single" w:color="999999" w:sz="4"/>
+              <w:right w:val="single" w:color="999999" w:sz="4"/>
+            </w:tcBorders>
+            <w:shd w:fill="FFFFFF" w:val="clear"/>
+            <w:tcMar>
+              <w:top w:type="dxa" w:w="90"/>
+              <w:left w:type="dxa" w:w="120"/>
+              <w:bottom w:type="dxa" w:w="90"/>
+              <w:right w:type="dxa" w:w="120"/>
+            </w:tcMar>
+          </w:tcPr>
+          <w:p>
+            <w:r>
+              <w:rPr>
+                <w:rFonts w:ascii="Calibri" w:cs="Calibri" w:eastAsia="Calibri" w:hAnsi="Calibri"/>
+                <w:b/>
+                <w:bCs/>
+                <w:color w:val="B7791F"/>
+                <w:sz w:val="19"/>
+                <w:szCs w:val="19"/>
+              </w:rPr>
+              <w:t xml:space="preserve">Будет исправлено</w:t>
+            </w:r>
+          </w:p>
+        </w:tc>
+        <w:tc>
+          <w:tcPr>
+            <w:tcW w:type="dxa" w:w="2100"/>
+            <w:tcBorders>
+              <w:top w:val="single" w:color="999999" w:sz="4"/>
+              <w:left w:val="single" w:color="999999" w:sz="4"/>
+              <w:bottom w:val="single" w:color="999999" w:sz="4"/>
+              <w:right w:val="single" w:color="999999" w:sz="4"/>
+            </w:tcBorders>
+            <w:shd w:fill="FFFFFF" w:val="clear"/>
+            <w:tcMar>
+              <w:top w:type="dxa" w:w="90"/>
+              <w:left w:type="dxa" w:w="120"/>
+              <w:bottom w:type="dxa" w:w="90"/>
+              <w:right w:type="dxa" w:w="120"/>
+            </w:tcMar>
+          </w:tcPr>
+          <w:p>
+            <w:r>
+              <w:rPr>
+                <w:rFonts w:ascii="Calibri" w:cs="Calibri" w:eastAsia="Calibri" w:hAnsi="Calibri"/>
+                <w:color w:val="555555"/>
+                <w:sz w:val="20"/>
+                <w:szCs w:val="20"/>
+              </w:rPr>
+              <w:t xml:space="preserve">—</w:t>
+            </w:r>
+          </w:p>
+        </w:tc>
+      </w:tr>
+      <w:tr>
+        <w:trPr>
+          <w:cantSplit/>
+        </w:trPr>
+        <w:tc>
+          <w:tcPr>
+            <w:tcW w:type="dxa" w:w="4900"/>
+            <w:tcBorders>
+              <w:top w:val="single" w:color="999999" w:sz="4"/>
+              <w:left w:val="single" w:color="999999" w:sz="4"/>
+              <w:bottom w:val="single" w:color="999999" w:sz="4"/>
+              <w:right w:val="single" w:color="999999" w:sz="4"/>
+            </w:tcBorders>
+            <w:shd w:fill="F4F6FB" w:val="clear"/>
+            <w:tcMar>
+              <w:top w:type="dxa" w:w="90"/>
+              <w:left w:type="dxa" w:w="120"/>
+              <w:bottom w:type="dxa" w:w="90"/>
+              <w:right w:type="dxa" w:w="120"/>
+            </w:tcMar>
+          </w:tcPr>
+          <w:p>
+            <w:pPr>
+              <w:spacing w:line="276"/>
+            </w:pPr>
+            <w:r>
+              <w:rPr>
+                <w:rFonts w:ascii="Calibri" w:cs="Calibri" w:eastAsia="Calibri" w:hAnsi="Calibri"/>
+                <w:color w:val="1A1A1A"/>
+                <w:sz w:val="20"/>
+                <w:szCs w:val="20"/>
+              </w:rPr>
+              <w:t xml:space="preserve">Модель по умолчанию слетает на первую в списке</w:t>
+            </w:r>
+          </w:p>
+        </w:tc>
+        <w:tc>
+          <w:tcPr>
+            <w:tcW w:type="dxa" w:w="2300"/>
+            <w:tcBorders>
+              <w:top w:val="single" w:color="999999" w:sz="4"/>
+              <w:left w:val="single" w:color="999999" w:sz="4"/>
+              <w:bottom w:val="single" w:color="999999" w:sz="4"/>
+              <w:right w:val="single" w:color="999999" w:sz="4"/>
+            </w:tcBorders>
+            <w:shd w:fill="F4F6FB" w:val="clear"/>
+            <w:tcMar>
+              <w:top w:type="dxa" w:w="90"/>
+              <w:left w:type="dxa" w:w="120"/>
+              <w:bottom w:type="dxa" w:w="90"/>
+              <w:right w:type="dxa" w:w="120"/>
+            </w:tcMar>
+          </w:tcPr>
+          <w:p>
+            <w:r>
+              <w:rPr>
+                <w:rFonts w:ascii="Calibri" w:cs="Calibri" w:eastAsia="Calibri" w:hAnsi="Calibri"/>
+                <w:b/>
+                <w:bCs/>
+                <w:color w:val="B7791F"/>
+                <w:sz w:val="19"/>
+                <w:szCs w:val="19"/>
+              </w:rPr>
+              <w:t xml:space="preserve">Берём в реализацию</w:t>
+            </w:r>
+          </w:p>
+        </w:tc>
+        <w:tc>
+          <w:tcPr>
+            <w:tcW w:type="dxa" w:w="2100"/>
+            <w:tcBorders>
+              <w:top w:val="single" w:color="999999" w:sz="4"/>
+              <w:left w:val="single" w:color="999999" w:sz="4"/>
+              <w:bottom w:val="single" w:color="999999" w:sz="4"/>
+              <w:right w:val="single" w:color="999999" w:sz="4"/>
+            </w:tcBorders>
+            <w:shd w:fill="F4F6FB" w:val="clear"/>
+            <w:tcMar>
+              <w:top w:type="dxa" w:w="90"/>
+              <w:left w:type="dxa" w:w="120"/>
+              <w:bottom w:type="dxa" w:w="90"/>
+              <w:right w:type="dxa" w:w="120"/>
+            </w:tcMar>
+          </w:tcPr>
+          <w:p>
+            <w:r>
+              <w:rPr>
+                <w:rFonts w:ascii="Calibri" w:cs="Calibri" w:eastAsia="Calibri" w:hAnsi="Calibri"/>
+                <w:color w:val="555555"/>
+                <w:sz w:val="20"/>
+                <w:szCs w:val="20"/>
+              </w:rPr>
+              <w:t xml:space="preserve">—</w:t>
+            </w:r>
+          </w:p>
+        </w:tc>
+      </w:tr>
+      <w:tr>
+        <w:trPr>
+          <w:cantSplit/>
+        </w:trPr>
+        <w:tc>
+          <w:tcPr>
+            <w:tcW w:type="dxa" w:w="4900"/>
+            <w:tcBorders>
+              <w:top w:val="single" w:color="999999" w:sz="4"/>
+              <w:left w:val="single" w:color="999999" w:sz="4"/>
+              <w:bottom w:val="single" w:color="999999" w:sz="4"/>
+              <w:right w:val="single" w:color="999999" w:sz="4"/>
+            </w:tcBorders>
+            <w:shd w:fill="FFFFFF" w:val="clear"/>
+            <w:tcMar>
+              <w:top w:type="dxa" w:w="90"/>
+              <w:left w:type="dxa" w:w="120"/>
+              <w:bottom w:type="dxa" w:w="90"/>
+              <w:right w:type="dxa" w:w="120"/>
+            </w:tcMar>
+          </w:tcPr>
+          <w:p>
+            <w:pPr>
+              <w:spacing w:line="276"/>
+            </w:pPr>
+            <w:r>
+              <w:rPr>
+                <w:rFonts w:ascii="Calibri" w:cs="Calibri" w:eastAsia="Calibri" w:hAnsi="Calibri"/>
+                <w:color w:val="1A1A1A"/>
+                <w:sz w:val="20"/>
+                <w:szCs w:val="20"/>
+              </w:rPr>
+              <w:t xml:space="preserve">Список базовых маскируемых элементов (встроенных типов PII)</w:t>
+            </w:r>
+          </w:p>
+        </w:tc>
+        <w:tc>
+          <w:tcPr>
+            <w:tcW w:type="dxa" w:w="2300"/>
+            <w:tcBorders>
+              <w:top w:val="single" w:color="999999" w:sz="4"/>
+              <w:left w:val="single" w:color="999999" w:sz="4"/>
+              <w:bottom w:val="single" w:color="999999" w:sz="4"/>
+              <w:right w:val="single" w:color="999999" w:sz="4"/>
+            </w:tcBorders>
+            <w:shd w:fill="FFFFFF" w:val="clear"/>
+            <w:tcMar>
+              <w:top w:type="dxa" w:w="90"/>
+              <w:left w:type="dxa" w:w="120"/>
+              <w:bottom w:type="dxa" w:w="90"/>
+              <w:right w:type="dxa" w:w="120"/>
+            </w:tcMar>
+          </w:tcPr>
+          <w:p>
+            <w:r>
+              <w:rPr>
+                <w:rFonts w:ascii="Calibri" w:cs="Calibri" w:eastAsia="Calibri" w:hAnsi="Calibri"/>
+                <w:b/>
+                <w:bCs/>
+                <w:color w:val="B7791F"/>
+                <w:sz w:val="19"/>
+                <w:szCs w:val="19"/>
+              </w:rPr>
+              <w:t xml:space="preserve">Берём в разработку</w:t>
+            </w:r>
+          </w:p>
+        </w:tc>
+        <w:tc>
+          <w:tcPr>
+            <w:tcW w:type="dxa" w:w="2100"/>
+            <w:tcBorders>
+              <w:top w:val="single" w:color="999999" w:sz="4"/>
+              <w:left w:val="single" w:color="999999" w:sz="4"/>
+              <w:bottom w:val="single" w:color="999999" w:sz="4"/>
+              <w:right w:val="single" w:color="999999" w:sz="4"/>
+            </w:tcBorders>
+            <w:shd w:fill="FFFFFF" w:val="clear"/>
+            <w:tcMar>
+              <w:top w:type="dxa" w:w="90"/>
+              <w:left w:type="dxa" w:w="120"/>
+              <w:bottom w:type="dxa" w:w="90"/>
+              <w:right w:type="dxa" w:w="120"/>
+            </w:tcMar>
+          </w:tcPr>
+          <w:p>
+            <w:r>
+              <w:rPr>
+                <w:rFonts w:ascii="Calibri" w:cs="Calibri" w:eastAsia="Calibri" w:hAnsi="Calibri"/>
+                <w:color w:val="555555"/>
+                <w:sz w:val="20"/>
+                <w:szCs w:val="20"/>
+              </w:rPr>
+              <w:t xml:space="preserve">—</w:t>
+            </w:r>
+          </w:p>
+        </w:tc>
+      </w:tr>
+      <w:tr>
+        <w:trPr>
+          <w:cantSplit/>
+        </w:trPr>
+        <w:tc>
+          <w:tcPr>
+            <w:tcW w:type="dxa" w:w="4900"/>
+            <w:tcBorders>
+              <w:top w:val="single" w:color="999999" w:sz="4"/>
+              <w:left w:val="single" w:color="999999" w:sz="4"/>
+              <w:bottom w:val="single" w:color="999999" w:sz="4"/>
+              <w:right w:val="single" w:color="999999" w:sz="4"/>
+            </w:tcBorders>
+            <w:shd w:fill="F4F6FB" w:val="clear"/>
+            <w:tcMar>
+              <w:top w:type="dxa" w:w="90"/>
+              <w:left w:type="dxa" w:w="120"/>
+              <w:bottom w:type="dxa" w:w="90"/>
+              <w:right w:type="dxa" w:w="120"/>
+            </w:tcMar>
+          </w:tcPr>
+          <w:p>
+            <w:pPr>
+              <w:spacing w:line="276"/>
+            </w:pPr>
+            <w:r>
+              <w:rPr>
+                <w:rFonts w:ascii="Calibri" w:cs="Calibri" w:eastAsia="Calibri" w:hAnsi="Calibri"/>
+                <w:color w:val="1A1A1A"/>
+                <w:sz w:val="20"/>
+                <w:szCs w:val="20"/>
+              </w:rPr>
+              <w:t xml:space="preserve">Кастомный префикс токена — [AGREEMENT_N] вместо [CUSTOM_N]</w:t>
+            </w:r>
+          </w:p>
+        </w:tc>
+        <w:tc>
+          <w:tcPr>
+            <w:tcW w:type="dxa" w:w="2300"/>
+            <w:tcBorders>
+              <w:top w:val="single" w:color="999999" w:sz="4"/>
+              <w:left w:val="single" w:color="999999" w:sz="4"/>
+              <w:bottom w:val="single" w:color="999999" w:sz="4"/>
+              <w:right w:val="single" w:color="999999" w:sz="4"/>
+            </w:tcBorders>
+            <w:shd w:fill="F4F6FB" w:val="clear"/>
+            <w:tcMar>
+              <w:top w:type="dxa" w:w="90"/>
+              <w:left w:type="dxa" w:w="120"/>
+              <w:bottom w:type="dxa" w:w="90"/>
+              <w:right w:type="dxa" w:w="120"/>
+            </w:tcMar>
+          </w:tcPr>
+          <w:p>
+            <w:r>
+              <w:rPr>
+                <w:rFonts w:ascii="Calibri" w:cs="Calibri" w:eastAsia="Calibri" w:hAnsi="Calibri"/>
+                <w:b/>
+                <w:bCs/>
+                <w:color w:val="B7791F"/>
+                <w:sz w:val="19"/>
+                <w:szCs w:val="19"/>
+              </w:rPr>
+              <w:t xml:space="preserve">Берём в разработку</w:t>
+            </w:r>
+          </w:p>
+        </w:tc>
+        <w:tc>
+          <w:tcPr>
+            <w:tcW w:type="dxa" w:w="2100"/>
+            <w:tcBorders>
+              <w:top w:val="single" w:color="999999" w:sz="4"/>
+              <w:left w:val="single" w:color="999999" w:sz="4"/>
+              <w:bottom w:val="single" w:color="999999" w:sz="4"/>
+              <w:right w:val="single" w:color="999999" w:sz="4"/>
+            </w:tcBorders>
+            <w:shd w:fill="F4F6FB" w:val="clear"/>
+            <w:tcMar>
+              <w:top w:type="dxa" w:w="90"/>
+              <w:left w:type="dxa" w:w="120"/>
+              <w:bottom w:type="dxa" w:w="90"/>
+              <w:right w:type="dxa" w:w="120"/>
+            </w:tcMar>
+          </w:tcPr>
+          <w:p>
+            <w:r>
+              <w:rPr>
+                <w:rFonts w:ascii="Calibri" w:cs="Calibri" w:eastAsia="Calibri" w:hAnsi="Calibri"/>
+                <w:color w:val="555555"/>
+                <w:sz w:val="20"/>
+                <w:szCs w:val="20"/>
+              </w:rPr>
+              <w:t xml:space="preserve">—</w:t>
             </w:r>
           </w:p>
         </w:tc>

</xml_diff>

<commit_message>
Add chat timestamp bug (shows request time, not response time)
New Q&A row 11 and a matching entry in the dev-tracking table.
</commit_message>
<xml_diff>
--- a/docs/platform/voprosy-otvety-tablica.docx
+++ b/docs/platform/voprosy-otvety-tablica.docx
@@ -1147,6 +1147,106 @@
           </w:p>
         </w:tc>
       </w:tr>
+      <w:tr>
+        <w:trPr>
+          <w:cantSplit/>
+        </w:trPr>
+        <w:tc>
+          <w:tcPr>
+            <w:tcW w:type="dxa" w:w="460"/>
+            <w:tcBorders>
+              <w:top w:val="single" w:color="999999" w:sz="4"/>
+              <w:left w:val="single" w:color="999999" w:sz="4"/>
+              <w:bottom w:val="single" w:color="999999" w:sz="4"/>
+              <w:right w:val="single" w:color="999999" w:sz="4"/>
+            </w:tcBorders>
+            <w:shd w:fill="FFFFFF" w:val="clear"/>
+            <w:tcMar>
+              <w:top w:type="dxa" w:w="90"/>
+              <w:left w:type="dxa" w:w="120"/>
+              <w:bottom w:type="dxa" w:w="90"/>
+              <w:right w:type="dxa" w:w="120"/>
+            </w:tcMar>
+          </w:tcPr>
+          <w:p>
+            <w:r>
+              <w:rPr>
+                <w:rFonts w:ascii="Calibri" w:cs="Calibri" w:eastAsia="Calibri" w:hAnsi="Calibri"/>
+                <w:color w:val="555555"/>
+                <w:sz w:val="20"/>
+                <w:szCs w:val="20"/>
+              </w:rPr>
+              <w:t xml:space="preserve">11</w:t>
+            </w:r>
+          </w:p>
+        </w:tc>
+        <w:tc>
+          <w:tcPr>
+            <w:tcW w:type="dxa" w:w="4200"/>
+            <w:tcBorders>
+              <w:top w:val="single" w:color="999999" w:sz="4"/>
+              <w:left w:val="single" w:color="999999" w:sz="4"/>
+              <w:bottom w:val="single" w:color="999999" w:sz="4"/>
+              <w:right w:val="single" w:color="999999" w:sz="4"/>
+            </w:tcBorders>
+            <w:shd w:fill="FFFFFF" w:val="clear"/>
+            <w:tcMar>
+              <w:top w:type="dxa" w:w="90"/>
+              <w:left w:type="dxa" w:w="120"/>
+              <w:bottom w:type="dxa" w:w="90"/>
+              <w:right w:type="dxa" w:w="120"/>
+            </w:tcMar>
+          </w:tcPr>
+          <w:p>
+            <w:pPr>
+              <w:spacing w:line="276"/>
+            </w:pPr>
+            <w:r>
+              <w:rPr>
+                <w:rFonts w:ascii="Calibri" w:cs="Calibri" w:eastAsia="Calibri" w:hAnsi="Calibri"/>
+                <w:b/>
+                <w:bCs/>
+                <w:color w:val="14181F"/>
+                <w:sz w:val="20"/>
+                <w:szCs w:val="20"/>
+              </w:rPr>
+              <w:t xml:space="preserve">При выводе ответа в чате указывается время, в которое был отправлен пользователем запрос, а не время выдачи ответа. Поправьте.</w:t>
+            </w:r>
+          </w:p>
+        </w:tc>
+        <w:tc>
+          <w:tcPr>
+            <w:tcW w:type="dxa" w:w="4640"/>
+            <w:tcBorders>
+              <w:top w:val="single" w:color="999999" w:sz="4"/>
+              <w:left w:val="single" w:color="999999" w:sz="4"/>
+              <w:bottom w:val="single" w:color="999999" w:sz="4"/>
+              <w:right w:val="single" w:color="999999" w:sz="4"/>
+            </w:tcBorders>
+            <w:shd w:fill="FFFFFF" w:val="clear"/>
+            <w:tcMar>
+              <w:top w:type="dxa" w:w="90"/>
+              <w:left w:type="dxa" w:w="120"/>
+              <w:bottom w:type="dxa" w:w="90"/>
+              <w:right w:type="dxa" w:w="120"/>
+            </w:tcMar>
+          </w:tcPr>
+          <w:p>
+            <w:pPr>
+              <w:spacing w:line="276"/>
+            </w:pPr>
+            <w:r>
+              <w:rPr>
+                <w:rFonts w:ascii="Calibri" w:cs="Calibri" w:eastAsia="Calibri" w:hAnsi="Calibri"/>
+                <w:color w:val="1A1A1A"/>
+                <w:sz w:val="20"/>
+                <w:szCs w:val="20"/>
+              </w:rPr>
+              <w:t xml:space="preserve">Тоже — берём в разработку.</w:t>
+            </w:r>
+          </w:p>
+        </w:tc>
+      </w:tr>
     </w:tbl>
     <w:p>
       <w:pPr>
@@ -1648,6 +1748,103 @@
               <w:right w:val="single" w:color="999999" w:sz="4"/>
             </w:tcBorders>
             <w:shd w:fill="F4F6FB" w:val="clear"/>
+            <w:tcMar>
+              <w:top w:type="dxa" w:w="90"/>
+              <w:left w:type="dxa" w:w="120"/>
+              <w:bottom w:type="dxa" w:w="90"/>
+              <w:right w:type="dxa" w:w="120"/>
+            </w:tcMar>
+          </w:tcPr>
+          <w:p>
+            <w:r>
+              <w:rPr>
+                <w:rFonts w:ascii="Calibri" w:cs="Calibri" w:eastAsia="Calibri" w:hAnsi="Calibri"/>
+                <w:color w:val="555555"/>
+                <w:sz w:val="20"/>
+                <w:szCs w:val="20"/>
+              </w:rPr>
+              <w:t xml:space="preserve">—</w:t>
+            </w:r>
+          </w:p>
+        </w:tc>
+      </w:tr>
+      <w:tr>
+        <w:trPr>
+          <w:cantSplit/>
+        </w:trPr>
+        <w:tc>
+          <w:tcPr>
+            <w:tcW w:type="dxa" w:w="4900"/>
+            <w:tcBorders>
+              <w:top w:val="single" w:color="999999" w:sz="4"/>
+              <w:left w:val="single" w:color="999999" w:sz="4"/>
+              <w:bottom w:val="single" w:color="999999" w:sz="4"/>
+              <w:right w:val="single" w:color="999999" w:sz="4"/>
+            </w:tcBorders>
+            <w:shd w:fill="FFFFFF" w:val="clear"/>
+            <w:tcMar>
+              <w:top w:type="dxa" w:w="90"/>
+              <w:left w:type="dxa" w:w="120"/>
+              <w:bottom w:type="dxa" w:w="90"/>
+              <w:right w:type="dxa" w:w="120"/>
+            </w:tcMar>
+          </w:tcPr>
+          <w:p>
+            <w:pPr>
+              <w:spacing w:line="276"/>
+            </w:pPr>
+            <w:r>
+              <w:rPr>
+                <w:rFonts w:ascii="Calibri" w:cs="Calibri" w:eastAsia="Calibri" w:hAnsi="Calibri"/>
+                <w:color w:val="1A1A1A"/>
+                <w:sz w:val="20"/>
+                <w:szCs w:val="20"/>
+              </w:rPr>
+              <w:t xml:space="preserve">Время в чате — метка отправки запроса вместо времени выдачи ответа</w:t>
+            </w:r>
+          </w:p>
+        </w:tc>
+        <w:tc>
+          <w:tcPr>
+            <w:tcW w:type="dxa" w:w="2300"/>
+            <w:tcBorders>
+              <w:top w:val="single" w:color="999999" w:sz="4"/>
+              <w:left w:val="single" w:color="999999" w:sz="4"/>
+              <w:bottom w:val="single" w:color="999999" w:sz="4"/>
+              <w:right w:val="single" w:color="999999" w:sz="4"/>
+            </w:tcBorders>
+            <w:shd w:fill="FFFFFF" w:val="clear"/>
+            <w:tcMar>
+              <w:top w:type="dxa" w:w="90"/>
+              <w:left w:type="dxa" w:w="120"/>
+              <w:bottom w:type="dxa" w:w="90"/>
+              <w:right w:type="dxa" w:w="120"/>
+            </w:tcMar>
+          </w:tcPr>
+          <w:p>
+            <w:r>
+              <w:rPr>
+                <w:rFonts w:ascii="Calibri" w:cs="Calibri" w:eastAsia="Calibri" w:hAnsi="Calibri"/>
+                <w:b/>
+                <w:bCs/>
+                <w:color w:val="B7791F"/>
+                <w:sz w:val="19"/>
+                <w:szCs w:val="19"/>
+              </w:rPr>
+              <w:t xml:space="preserve">Берём в разработку</w:t>
+            </w:r>
+          </w:p>
+        </w:tc>
+        <w:tc>
+          <w:tcPr>
+            <w:tcW w:type="dxa" w:w="2100"/>
+            <w:tcBorders>
+              <w:top w:val="single" w:color="999999" w:sz="4"/>
+              <w:left w:val="single" w:color="999999" w:sz="4"/>
+              <w:bottom w:val="single" w:color="999999" w:sz="4"/>
+              <w:right w:val="single" w:color="999999" w:sz="4"/>
+            </w:tcBorders>
+            <w:shd w:fill="FFFFFF" w:val="clear"/>
             <w:tcMar>
               <w:top w:type="dxa" w:w="90"/>
               <w:left w:type="dxa" w:w="120"/>

</xml_diff>

<commit_message>
Unify status wording to "Берём в реализацию" everywhere
Was a mix of "будет исправлено" / "берём в разработку" / "берём в
реализацию" across the main table and the dev-tracking table, which
read as different commitment levels. Now consistent.
</commit_message>
<xml_diff>
--- a/docs/platform/voprosy-otvety-tablica.docx
+++ b/docs/platform/voprosy-otvety-tablica.docx
@@ -542,7 +542,7 @@
                 <w:sz w:val="20"/>
                 <w:szCs w:val="20"/>
               </w:rPr>
-              <w:t xml:space="preserve">Известная проблема — будет исправлено.</w:t>
+              <w:t xml:space="preserve">Известная проблема — берём в реализацию.</w:t>
             </w:r>
           </w:p>
         </w:tc>
@@ -842,7 +842,7 @@
                 <w:sz w:val="20"/>
                 <w:szCs w:val="20"/>
               </w:rPr>
-              <w:t xml:space="preserve">Да, но потребуются изменения в системе — берём в разработку.</w:t>
+              <w:t xml:space="preserve">Да, но потребуются изменения в системе — берём в реализацию.</w:t>
             </w:r>
           </w:p>
         </w:tc>
@@ -942,7 +942,7 @@
                 <w:sz w:val="20"/>
                 <w:szCs w:val="20"/>
               </w:rPr>
-              <w:t xml:space="preserve">Через экран «Regex-паттерны» нельзя — тип токена там закрытый список (PERSON/PROJECT/COMPANY/PRODUCT/CUSTOM), свой префикс сейчас не вписать. Будем брать в разработку.</w:t>
+              <w:t xml:space="preserve">Через экран «Regex-паттерны» нельзя — тип токена там закрытый список (PERSON/PROJECT/COMPANY/PRODUCT/CUSTOM), свой префикс сейчас не вписать. Берём в реализацию.</w:t>
             </w:r>
           </w:p>
         </w:tc>
@@ -1242,7 +1242,7 @@
                 <w:sz w:val="20"/>
                 <w:szCs w:val="20"/>
               </w:rPr>
-              <w:t xml:space="preserve">Тоже — берём в разработку.</w:t>
+              <w:t xml:space="preserve">Тоже — берём в реализацию.</w:t>
             </w:r>
           </w:p>
         </w:tc>
@@ -1443,7 +1443,7 @@
                 <w:sz w:val="19"/>
                 <w:szCs w:val="19"/>
               </w:rPr>
-              <w:t xml:space="preserve">Будет исправлено</w:t>
+              <w:t xml:space="preserve">Берём в реализацию</w:t>
             </w:r>
           </w:p>
         </w:tc>
@@ -1637,7 +1637,7 @@
                 <w:sz w:val="19"/>
                 <w:szCs w:val="19"/>
               </w:rPr>
-              <w:t xml:space="preserve">Берём в разработку</w:t>
+              <w:t xml:space="preserve">Берём в реализацию</w:t>
             </w:r>
           </w:p>
         </w:tc>
@@ -1734,7 +1734,7 @@
                 <w:sz w:val="19"/>
                 <w:szCs w:val="19"/>
               </w:rPr>
-              <w:t xml:space="preserve">Берём в разработку</w:t>
+              <w:t xml:space="preserve">Берём в реализацию</w:t>
             </w:r>
           </w:p>
         </w:tc>
@@ -1831,7 +1831,7 @@
                 <w:sz w:val="19"/>
                 <w:szCs w:val="19"/>
               </w:rPr>
-              <w:t xml:space="preserve">Берём в разработку</w:t>
+              <w:t xml:space="preserve">Берём в реализацию</w:t>
             </w:r>
           </w:p>
         </w:tc>

</xml_diff>

<commit_message>
Correct chat-timestamp answer; clarify multi-domain is methodological, not just technical
Chat timestamp under the answer already shows response time, not
request time - not a bug, removed from the dev-tracking table.
Multi-domain auth answer now reflects that this was already discussed
at the pilot stage as work that's more methodological (how to map
roles/users across domains) than purely technical.
</commit_message>
<xml_diff>
--- a/docs/platform/voprosy-otvety-tablica.docx
+++ b/docs/platform/voprosy-otvety-tablica.docx
@@ -1142,7 +1142,7 @@
                 <w:sz w:val="20"/>
                 <w:szCs w:val="20"/>
               </w:rPr>
-              <w:t xml:space="preserve">По документации — нет, конфиг рассчитан на один AD-домен.</w:t>
+              <w:t xml:space="preserve">Обсуждали ещё на этапе пилота — это доработка, и не столько техническая, сколько методологическая (как сопоставлять роли и пользователей между доменами).</w:t>
             </w:r>
           </w:p>
         </w:tc>
@@ -1242,7 +1242,7 @@
                 <w:sz w:val="20"/>
                 <w:szCs w:val="20"/>
               </w:rPr>
-              <w:t xml:space="preserve">Тоже — берём в реализацию.</w:t>
+              <w:t xml:space="preserve">Нет — под ответом указано время выдачи ответа.</w:t>
             </w:r>
           </w:p>
         </w:tc>
@@ -1748,103 +1748,6 @@
               <w:right w:val="single" w:color="999999" w:sz="4"/>
             </w:tcBorders>
             <w:shd w:fill="F4F6FB" w:val="clear"/>
-            <w:tcMar>
-              <w:top w:type="dxa" w:w="90"/>
-              <w:left w:type="dxa" w:w="120"/>
-              <w:bottom w:type="dxa" w:w="90"/>
-              <w:right w:type="dxa" w:w="120"/>
-            </w:tcMar>
-          </w:tcPr>
-          <w:p>
-            <w:r>
-              <w:rPr>
-                <w:rFonts w:ascii="Calibri" w:cs="Calibri" w:eastAsia="Calibri" w:hAnsi="Calibri"/>
-                <w:color w:val="555555"/>
-                <w:sz w:val="20"/>
-                <w:szCs w:val="20"/>
-              </w:rPr>
-              <w:t xml:space="preserve">—</w:t>
-            </w:r>
-          </w:p>
-        </w:tc>
-      </w:tr>
-      <w:tr>
-        <w:trPr>
-          <w:cantSplit/>
-        </w:trPr>
-        <w:tc>
-          <w:tcPr>
-            <w:tcW w:type="dxa" w:w="4900"/>
-            <w:tcBorders>
-              <w:top w:val="single" w:color="999999" w:sz="4"/>
-              <w:left w:val="single" w:color="999999" w:sz="4"/>
-              <w:bottom w:val="single" w:color="999999" w:sz="4"/>
-              <w:right w:val="single" w:color="999999" w:sz="4"/>
-            </w:tcBorders>
-            <w:shd w:fill="FFFFFF" w:val="clear"/>
-            <w:tcMar>
-              <w:top w:type="dxa" w:w="90"/>
-              <w:left w:type="dxa" w:w="120"/>
-              <w:bottom w:type="dxa" w:w="90"/>
-              <w:right w:type="dxa" w:w="120"/>
-            </w:tcMar>
-          </w:tcPr>
-          <w:p>
-            <w:pPr>
-              <w:spacing w:line="276"/>
-            </w:pPr>
-            <w:r>
-              <w:rPr>
-                <w:rFonts w:ascii="Calibri" w:cs="Calibri" w:eastAsia="Calibri" w:hAnsi="Calibri"/>
-                <w:color w:val="1A1A1A"/>
-                <w:sz w:val="20"/>
-                <w:szCs w:val="20"/>
-              </w:rPr>
-              <w:t xml:space="preserve">Время в чате — метка отправки запроса вместо времени выдачи ответа</w:t>
-            </w:r>
-          </w:p>
-        </w:tc>
-        <w:tc>
-          <w:tcPr>
-            <w:tcW w:type="dxa" w:w="2300"/>
-            <w:tcBorders>
-              <w:top w:val="single" w:color="999999" w:sz="4"/>
-              <w:left w:val="single" w:color="999999" w:sz="4"/>
-              <w:bottom w:val="single" w:color="999999" w:sz="4"/>
-              <w:right w:val="single" w:color="999999" w:sz="4"/>
-            </w:tcBorders>
-            <w:shd w:fill="FFFFFF" w:val="clear"/>
-            <w:tcMar>
-              <w:top w:type="dxa" w:w="90"/>
-              <w:left w:type="dxa" w:w="120"/>
-              <w:bottom w:type="dxa" w:w="90"/>
-              <w:right w:type="dxa" w:w="120"/>
-            </w:tcMar>
-          </w:tcPr>
-          <w:p>
-            <w:r>
-              <w:rPr>
-                <w:rFonts w:ascii="Calibri" w:cs="Calibri" w:eastAsia="Calibri" w:hAnsi="Calibri"/>
-                <w:b/>
-                <w:bCs/>
-                <w:color w:val="B7791F"/>
-                <w:sz w:val="19"/>
-                <w:szCs w:val="19"/>
-              </w:rPr>
-              <w:t xml:space="preserve">Берём в реализацию</w:t>
-            </w:r>
-          </w:p>
-        </w:tc>
-        <w:tc>
-          <w:tcPr>
-            <w:tcW w:type="dxa" w:w="2100"/>
-            <w:tcBorders>
-              <w:top w:val="single" w:color="999999" w:sz="4"/>
-              <w:left w:val="single" w:color="999999" w:sz="4"/>
-              <w:bottom w:val="single" w:color="999999" w:sz="4"/>
-              <w:right w:val="single" w:color="999999" w:sz="4"/>
-            </w:tcBorders>
-            <w:shd w:fill="FFFFFF" w:val="clear"/>
             <w:tcMar>
               <w:top w:type="dxa" w:w="90"/>
               <w:left w:type="dxa" w:w="120"/>

</xml_diff>